<commit_message>
Update defense report to v3.1.7 (1786 tests / 100% coverage)
</commit_message>
<xml_diff>
--- a/docs/Smart_Accounting_Platform_Report.docx
+++ b/docs/Smart_Accounting_Platform_Report.docx
@@ -532,7 +532,7 @@
           <w:sz w:val="22"/>
           <w:rtl/>
         </w:rPr>
-        <w:t>وصل المشروع إلى الإصدار v3.1.7 بعد جلسات تطوير متتالية أضافت ميزات متقدمة شملت تحليل DuPont، تحليل السيناريوهات، المعايير المرجعية، لوحة التحكم المتقدمة، الامتثال الضريبي الكامل، محرك الرؤى الذكية، تحليل مراكز التكلفة، تعدد العملات، المزامنة السحابية، والشركات التجريبية.</w:t>
+        <w:t>وصل المشروع إلى الإصدار v3.1.7 بعد جلسات تطوير متتالية أضافت ميزات متقدمة شملت تحليل DuPont، تحليل السيناريوهات، المعايير المرجعية، لوحة التحكم المتقدمة، الامتثال الضريبي الكامل، محرك الرؤى الذكية، تحليل مراكز التكلفة، تعدد العملات، المزامنة السحابية، الشركات التجريبية، واختبار UAT شامل (1786 اختباراً ناجحاً).</w:t>
       </w:r>
     </w:p>
     <w:p>
@@ -970,7 +970,7 @@
           <w:sz w:val="22"/>
           <w:rtl/>
         </w:rPr>
-        <w:t>ح. توفير 1229 اختبار وحدة ناجحاً مع تغطية 99% للوحدات البرمجية</w:t>
+        <w:t>ح. توفير 1786 اختبار وحدة ناجحاً مع تغطية 100% للوحدات البرمجية</w:t>
       </w:r>
     </w:p>
     <w:p>
@@ -1535,7 +1535,7 @@
           <w:sz w:val="22"/>
           <w:rtl/>
         </w:rPr>
-        <w:t>7. الاختبار والتحسين المستمر (1229 اختباراً + تغطية 99%)</w:t>
+        <w:t>7. الاختبار والتحسين المستمر (1786 اختباراً + تغطية 100%)</w:t>
       </w:r>
     </w:p>
     <w:p>
@@ -7034,6 +7034,102 @@
           <w:sz w:val="26"/>
           <w:rtl/>
         </w:rPr>
+        <w:t>13.12 اختبار UAT الشامل (v3.1.7)</w:t>
+      </w:r>
+    </w:p>
+    <w:p>
+      <w:pPr>
+        <w:bidi/>
+        <w:spacing w:after="60"/>
+        <w:ind w:left="454"/>
+        <w:jc w:val="right"/>
+      </w:pPr>
+      <w:r>
+        <w:rPr>
+          <w:rFonts w:ascii="Tahoma" w:hAnsi="Tahoma" w:cs="Tahoma" w:eastAsia="Tahoma"/>
+          <w:b/>
+          <w:sz w:val="22"/>
+          <w:rtl/>
+        </w:rPr>
+        <w:t xml:space="preserve">• </w:t>
+      </w:r>
+      <w:r>
+        <w:rPr>
+          <w:rFonts w:ascii="Tahoma" w:hAnsi="Tahoma" w:cs="Tahoma" w:eastAsia="Tahoma"/>
+          <w:b w:val="0"/>
+          <w:sz w:val="22"/>
+          <w:rtl/>
+        </w:rPr>
+        <w:t>رحلة مستخدم حقيقية عبر التطبيق: تسجيل دخول + تجوّل 35 شاشة + إدخال بيانات + تبديل 3 لغات + حفظ + تسجيل خروج (tests/test_uat.py)</w:t>
+      </w:r>
+    </w:p>
+    <w:p>
+      <w:pPr>
+        <w:bidi/>
+        <w:spacing w:after="60"/>
+        <w:ind w:left="454"/>
+        <w:jc w:val="right"/>
+      </w:pPr>
+      <w:r>
+        <w:rPr>
+          <w:rFonts w:ascii="Tahoma" w:hAnsi="Tahoma" w:cs="Tahoma" w:eastAsia="Tahoma"/>
+          <w:b/>
+          <w:sz w:val="22"/>
+          <w:rtl/>
+        </w:rPr>
+        <w:t xml:space="preserve">• </w:t>
+      </w:r>
+      <w:r>
+        <w:rPr>
+          <w:rFonts w:ascii="Tahoma" w:hAnsi="Tahoma" w:cs="Tahoma" w:eastAsia="Tahoma"/>
+          <w:b w:val="0"/>
+          <w:sz w:val="22"/>
+          <w:rtl/>
+        </w:rPr>
+        <w:t>كشف وإصلاح بغّ حقيقي: تبديل اللغة على شاشتي المزامنة البنكية واستيراد البيانات كان يسقط التطبيق (_clear_layout)</w:t>
+      </w:r>
+    </w:p>
+    <w:p>
+      <w:pPr>
+        <w:bidi/>
+        <w:spacing w:after="60"/>
+        <w:ind w:left="454"/>
+        <w:jc w:val="right"/>
+      </w:pPr>
+      <w:r>
+        <w:rPr>
+          <w:rFonts w:ascii="Tahoma" w:hAnsi="Tahoma" w:cs="Tahoma" w:eastAsia="Tahoma"/>
+          <w:b/>
+          <w:sz w:val="22"/>
+          <w:rtl/>
+        </w:rPr>
+        <w:t xml:space="preserve">• </w:t>
+      </w:r>
+      <w:r>
+        <w:rPr>
+          <w:rFonts w:ascii="Tahoma" w:hAnsi="Tahoma" w:cs="Tahoma" w:eastAsia="Tahoma"/>
+          <w:b w:val="0"/>
+          <w:sz w:val="22"/>
+          <w:rtl/>
+        </w:rPr>
+        <w:t>1786 اختباراً ناجحاً + تغطية وحدات 100%</w:t>
+      </w:r>
+    </w:p>
+    <w:p>
+      <w:pPr>
+        <w:keepNext/>
+        <w:bidi/>
+        <w:spacing w:before="200" w:after="120"/>
+        <w:jc w:val="right"/>
+      </w:pPr>
+      <w:r>
+        <w:rPr>
+          <w:rFonts w:ascii="Tahoma" w:hAnsi="Tahoma" w:cs="Tahoma" w:eastAsia="Tahoma"/>
+          <w:b/>
+          <w:color w:val="1E3A5F"/>
+          <w:sz w:val="26"/>
+          <w:rtl/>
+        </w:rPr>
         <w:t>13.12 تحسينات UI/UX</w:t>
       </w:r>
     </w:p>
@@ -7183,7 +7279,7 @@
           <w:sz w:val="22"/>
           <w:rtl/>
         </w:rPr>
-        <w:t>بلغت تغطية الوحدات البرمجية 99% عبر `python -m coverage run --source=modules --omit="modules/__init__.py" -m pytest tests -q` (كانت 73%)، وكل ملفات modules/ عند 100% ما عدا tax_reminders.py بنسبة 98% (فرع ميت غير قابل للوصول).</w:t>
+        <w:t>بلغت تغطية الوحدات البرمجية 100% عبر `python -m coverage run --source=modules --omit="modules/__init__.py" -m pytest tests -q` (كانت 73% ثم 99%)، وكل ملفات modules/ عند 100% (5768 سطراً بلا أي سطر مفقود).</w:t>
       </w:r>
     </w:p>
     <w:p>
@@ -8388,7 +8484,7 @@
           <w:sz w:val="22"/>
           <w:rtl/>
         </w:rPr>
-        <w:t>1229 اختباراً ناجحاً مع تغطية 99% للوحدات</w:t>
+        <w:t>1786 اختباراً ناجحاً مع تغطية 100% للوحدات</w:t>
       </w:r>
     </w:p>
     <w:p>
@@ -8440,7 +8536,7 @@
           <w:sz w:val="22"/>
           <w:rtl/>
         </w:rPr>
-        <w:t>مثبت Inno Setup (63.2MB) ونسخة ZIP (41.4MB) وتحديث تلقائي مخفي</w:t>
+        <w:t>مثبت Inno Setup (51.6MB) ونسخة ZIP (82.9MB) وتحديث تلقائي مخفي</w:t>
       </w:r>
     </w:p>
     <w:p>
@@ -8493,7 +8589,7 @@
           <w:sz w:val="22"/>
           <w:rtl/>
         </w:rPr>
-        <w:t>تم تطوير المشروع وفق أفضل ممارسات هندسة البرمجيات، مع الالتزام بمبادئ الجودة والاختبار المستمر، مما نتج عنه 1229 اختبار وحدة ناجحاً وتغطية 99% للوحدات. كما تم توفير نظام تحديث تلقائي لتسهيل عملية التطوير والصيانة المستمرة.</w:t>
+        <w:t>تم تطوير المشروع وفق أفضل ممارسات هندسة البرمجيات، مع الالتزام بمبادئ الجودة والاختبار المستمر، مما نتج عنه 1786 اختبار وحدة ناجحاً وتغطية 100% للوحدات. كما تم توفير نظام تحديث تلقائي لتسهيل عملية التطوير والصيانة المستمرة.</w:t>
       </w:r>
     </w:p>
     <w:p>

</xml_diff>

<commit_message>
Fix v3.1.7 installer issues: keep user state on upgrade, show 'enter amount' before input
- installer.iss: Excludes state files (users/settings/accounting_data/chat_history/login_session/activity_log/db/logs/data/backups) so upgrades keep real user data and password
- data_entry.py: financial spins show localized 'enter amount' label instead of 0.00 before input (new i18n key de_enter_amount x3)
- main_window.py: log stack trace when a lazy-loaded view fails to build
- tests: regression test test_financial_spins_show_empty_before_input (1787 total)
- docs: PROJECT_MAP/AGENTS session 65, changelog upd_new33 (AR/EN/FR), version.json, KNOWLEDGE_BASE, report regenerated (1787 tests, 13.13 section)
</commit_message>
<xml_diff>
--- a/docs/Smart_Accounting_Platform_Report.docx
+++ b/docs/Smart_Accounting_Platform_Report.docx
@@ -532,7 +532,7 @@
           <w:sz w:val="22"/>
           <w:rtl/>
         </w:rPr>
-        <w:t>وصل المشروع إلى الإصدار v3.1.7 بعد جلسات تطوير متتالية أضافت ميزات متقدمة شملت تحليل DuPont، تحليل السيناريوهات، المعايير المرجعية، لوحة التحكم المتقدمة، الامتثال الضريبي الكامل، محرك الرؤى الذكية، تحليل مراكز التكلفة، تعدد العملات، المزامنة السحابية، الشركات التجريبية، واختبار UAT شامل (1786 اختباراً ناجحاً).</w:t>
+        <w:t>وصل المشروع إلى الإصدار v3.1.7 بعد جلسات تطوير متتالية أضافت ميزات متقدمة شملت تحليل DuPont، تحليل السيناريوهات، المعايير المرجعية، لوحة التحكم المتقدمة، الامتثال الضريبي الكامل، محرك الرؤى الذكية، تحليل مراكز التكلفة، تعدد العملات، المزامنة السحابية، الشركات التجريبية، واختبار UAT شامل (1787 اختباراً ناجحاً).</w:t>
       </w:r>
     </w:p>
     <w:p>
@@ -970,7 +970,7 @@
           <w:sz w:val="22"/>
           <w:rtl/>
         </w:rPr>
-        <w:t>ح. توفير 1786 اختبار وحدة ناجحاً مع تغطية 100% للوحدات البرمجية</w:t>
+        <w:t>ح. توفير 1787 اختبار وحدة ناجحاً مع تغطية 100% للوحدات البرمجية</w:t>
       </w:r>
     </w:p>
     <w:p>
@@ -1535,7 +1535,7 @@
           <w:sz w:val="22"/>
           <w:rtl/>
         </w:rPr>
-        <w:t>7. الاختبار والتحسين المستمر (1786 اختباراً + تغطية 100%)</w:t>
+        <w:t>7. الاختبار والتحسين المستمر (1787 اختباراً + تغطية 100%)</w:t>
       </w:r>
     </w:p>
     <w:p>
@@ -7112,7 +7112,7 @@
           <w:sz w:val="22"/>
           <w:rtl/>
         </w:rPr>
-        <w:t>1786 اختباراً ناجحاً + تغطية وحدات 100%</w:t>
+        <w:t>1787 اختباراً ناجحاً + تغطية وحدات 100%</w:t>
       </w:r>
     </w:p>
     <w:p>
@@ -7130,7 +7130,155 @@
           <w:sz w:val="26"/>
           <w:rtl/>
         </w:rPr>
-        <w:t>13.12 تحسينات UI/UX</w:t>
+        <w:t>13.13 إصلاح مشاكل النسخة المثبّتة (v3.1.7)</w:t>
+      </w:r>
+    </w:p>
+    <w:p>
+      <w:pPr>
+        <w:bidi/>
+        <w:spacing w:after="60"/>
+        <w:ind w:left="454"/>
+        <w:jc w:val="right"/>
+      </w:pPr>
+      <w:r>
+        <w:rPr>
+          <w:rFonts w:ascii="Tahoma" w:hAnsi="Tahoma" w:cs="Tahoma" w:eastAsia="Tahoma"/>
+          <w:b/>
+          <w:sz w:val="22"/>
+          <w:rtl/>
+        </w:rPr>
+        <w:t xml:space="preserve">• </w:t>
+      </w:r>
+      <w:r>
+        <w:rPr>
+          <w:rFonts w:ascii="Tahoma" w:hAnsi="Tahoma" w:cs="Tahoma" w:eastAsia="Tahoma"/>
+          <w:b w:val="0"/>
+          <w:sz w:val="22"/>
+          <w:rtl/>
+        </w:rPr>
+        <w:t>الشاشات الفارغة: الترقية القادمة من Setup-v3.1.6 وصلت ناقصة الملفات الحرجة (sqlite3.dll/_sqlite3.pyd + pandas/_libs + pytz/zoneinfo) — نُسخت الملفات المفقودة وتحقق آلي بتحميل كل الشاشات بلا استثناءات</w:t>
+      </w:r>
+    </w:p>
+    <w:p>
+      <w:pPr>
+        <w:bidi/>
+        <w:spacing w:after="60"/>
+        <w:ind w:left="454"/>
+        <w:jc w:val="right"/>
+      </w:pPr>
+      <w:r>
+        <w:rPr>
+          <w:rFonts w:ascii="Tahoma" w:hAnsi="Tahoma" w:cs="Tahoma" w:eastAsia="Tahoma"/>
+          <w:b/>
+          <w:sz w:val="22"/>
+          <w:rtl/>
+        </w:rPr>
+        <w:t xml:space="preserve">• </w:t>
+      </w:r>
+      <w:r>
+        <w:rPr>
+          <w:rFonts w:ascii="Tahoma" w:hAnsi="Tahoma" w:cs="Tahoma" w:eastAsia="Tahoma"/>
+          <w:b w:val="0"/>
+          <w:sz w:val="22"/>
+          <w:rtl/>
+        </w:rPr>
+        <w:t>تجمّد تحليل DuPont عند العودة: سببه ملفات numpy/matplotlib الناقصة في التثبيت — بعد النسخ تحقق بدورة عودة مزدوجة بلا تجمّد</w:t>
+      </w:r>
+    </w:p>
+    <w:p>
+      <w:pPr>
+        <w:bidi/>
+        <w:spacing w:after="60"/>
+        <w:ind w:left="454"/>
+        <w:jc w:val="right"/>
+      </w:pPr>
+      <w:r>
+        <w:rPr>
+          <w:rFonts w:ascii="Tahoma" w:hAnsi="Tahoma" w:cs="Tahoma" w:eastAsia="Tahoma"/>
+          <w:b/>
+          <w:sz w:val="22"/>
+          <w:rtl/>
+        </w:rPr>
+        <w:t xml:space="preserve">• </w:t>
+      </w:r>
+      <w:r>
+        <w:rPr>
+          <w:rFonts w:ascii="Tahoma" w:hAnsi="Tahoma" w:cs="Tahoma" w:eastAsia="Tahoma"/>
+          <w:b w:val="0"/>
+          <w:sz w:val="22"/>
+          <w:rtl/>
+        </w:rPr>
+        <w:t>الأرقام قبل الإدخال: حقول المبالغ أصبحت تعرض «أدخل المبلغ» بدل 0.00 (مفتاح i18n جديد + اختبار انحدار)</w:t>
+      </w:r>
+    </w:p>
+    <w:p>
+      <w:pPr>
+        <w:bidi/>
+        <w:spacing w:after="60"/>
+        <w:ind w:left="454"/>
+        <w:jc w:val="right"/>
+      </w:pPr>
+      <w:r>
+        <w:rPr>
+          <w:rFonts w:ascii="Tahoma" w:hAnsi="Tahoma" w:cs="Tahoma" w:eastAsia="Tahoma"/>
+          <w:b/>
+          <w:sz w:val="22"/>
+          <w:rtl/>
+        </w:rPr>
+        <w:t xml:space="preserve">• </w:t>
+      </w:r>
+      <w:r>
+        <w:rPr>
+          <w:rFonts w:ascii="Tahoma" w:hAnsi="Tahoma" w:cs="Tahoma" w:eastAsia="Tahoma"/>
+          <w:b w:val="0"/>
+          <w:sz w:val="22"/>
+          <w:rtl/>
+        </w:rPr>
+        <w:t>الترقية تطلب سرّية جديدة: المثبّت أصبح يستثني ملفات الحالة (users/settings/accounting_data/DB/logs/data/backups) — تحقق حقيقي: ترقية فوق تثبيت سابق حافظت على users.json الحرفي</w:t>
+      </w:r>
+    </w:p>
+    <w:p>
+      <w:pPr>
+        <w:bidi/>
+        <w:spacing w:after="60"/>
+        <w:ind w:left="454"/>
+        <w:jc w:val="right"/>
+      </w:pPr>
+      <w:r>
+        <w:rPr>
+          <w:rFonts w:ascii="Tahoma" w:hAnsi="Tahoma" w:cs="Tahoma" w:eastAsia="Tahoma"/>
+          <w:b/>
+          <w:sz w:val="22"/>
+          <w:rtl/>
+        </w:rPr>
+        <w:t xml:space="preserve">• </w:t>
+      </w:r>
+      <w:r>
+        <w:rPr>
+          <w:rFonts w:ascii="Tahoma" w:hAnsi="Tahoma" w:cs="Tahoma" w:eastAsia="Tahoma"/>
+          <w:b w:val="0"/>
+          <w:sz w:val="22"/>
+          <w:rtl/>
+        </w:rPr>
+        <w:t>إعادة بناء Nuitka (exe 137MB) + Inno Setup (63.8MB) + ZIP محمول (104.3MB بلا ملفات حالة)</w:t>
+      </w:r>
+    </w:p>
+    <w:p>
+      <w:pPr>
+        <w:keepNext/>
+        <w:bidi/>
+        <w:spacing w:before="200" w:after="120"/>
+        <w:jc w:val="right"/>
+      </w:pPr>
+      <w:r>
+        <w:rPr>
+          <w:rFonts w:ascii="Tahoma" w:hAnsi="Tahoma" w:cs="Tahoma" w:eastAsia="Tahoma"/>
+          <w:b/>
+          <w:color w:val="1E3A5F"/>
+          <w:sz w:val="26"/>
+          <w:rtl/>
+        </w:rPr>
+        <w:t>13.14 تحسينات UI/UX</w:t>
       </w:r>
     </w:p>
     <w:p>
@@ -8484,7 +8632,7 @@
           <w:sz w:val="22"/>
           <w:rtl/>
         </w:rPr>
-        <w:t>1786 اختباراً ناجحاً مع تغطية 100% للوحدات</w:t>
+        <w:t>1787 اختباراً ناجحاً مع تغطية 100% للوحدات</w:t>
       </w:r>
     </w:p>
     <w:p>
@@ -8589,7 +8737,7 @@
           <w:sz w:val="22"/>
           <w:rtl/>
         </w:rPr>
-        <w:t>تم تطوير المشروع وفق أفضل ممارسات هندسة البرمجيات، مع الالتزام بمبادئ الجودة والاختبار المستمر، مما نتج عنه 1786 اختبار وحدة ناجحاً وتغطية 100% للوحدات. كما تم توفير نظام تحديث تلقائي لتسهيل عملية التطوير والصيانة المستمرة.</w:t>
+        <w:t>تم تطوير المشروع وفق أفضل ممارسات هندسة البرمجيات، مع الالتزام بمبادئ الجودة والاختبار المستمر، مما نتج عنه 1787 اختبار وحدة ناجحاً وتغطية 100% للوحدات. كما تم توفير نظام تحديث تلقائي لتسهيل عملية التطوير والصيانة المستمرة.</w:t>
       </w:r>
     </w:p>
     <w:p>

</xml_diff>

<commit_message>
docs: session 66 final - 1800 tests (4 perf + 9 exporters), exporter layer migrated to 3 views, report 13.14/13.15 regenerated (DOCX 53,935B / PDF 264,625B)
</commit_message>
<xml_diff>
--- a/docs/Smart_Accounting_Platform_Report.docx
+++ b/docs/Smart_Accounting_Platform_Report.docx
@@ -970,7 +970,7 @@
           <w:sz w:val="22"/>
           <w:rtl/>
         </w:rPr>
-        <w:t>ح. توفير 1787 اختبار وحدة ناجحاً مع تغطية 100% للوحدات البرمجية</w:t>
+        <w:t>ح. توفير 1800 اختبار وحدة ناجحاً مع تغطية 100% للوحدات البرمجية</w:t>
       </w:r>
     </w:p>
     <w:p>
@@ -1535,7 +1535,7 @@
           <w:sz w:val="22"/>
           <w:rtl/>
         </w:rPr>
-        <w:t>7. الاختبار والتحسين المستمر (1787 اختباراً + تغطية 100%)</w:t>
+        <w:t>7. الاختبار والتحسين المستمر (1800 اختباراً + تغطية 100%)</w:t>
       </w:r>
     </w:p>
     <w:p>
@@ -7112,7 +7112,7 @@
           <w:sz w:val="22"/>
           <w:rtl/>
         </w:rPr>
-        <w:t>1787 اختباراً ناجحاً + تغطية وحدات 100%</w:t>
+        <w:t>1800 اختباراً ناجحاً + تغطية وحدات 100%</w:t>
       </w:r>
     </w:p>
     <w:p>
@@ -7278,7 +7278,155 @@
           <w:sz w:val="26"/>
           <w:rtl/>
         </w:rPr>
-        <w:t>13.14 تحسينات UI/UX</w:t>
+        <w:t>13.14 معالجة ملاحظات تحليل المشروع (2026-08-04)</w:t>
+      </w:r>
+    </w:p>
+    <w:p>
+      <w:pPr>
+        <w:bidi/>
+        <w:spacing w:after="60"/>
+        <w:ind w:left="454"/>
+        <w:jc w:val="right"/>
+      </w:pPr>
+      <w:r>
+        <w:rPr>
+          <w:rFonts w:ascii="Tahoma" w:hAnsi="Tahoma" w:cs="Tahoma" w:eastAsia="Tahoma"/>
+          <w:b/>
+          <w:sz w:val="22"/>
+          <w:rtl/>
+        </w:rPr>
+        <w:t xml:space="preserve">• </w:t>
+      </w:r>
+      <w:r>
+        <w:rPr>
+          <w:rFonts w:ascii="Tahoma" w:hAnsi="Tahoma" w:cs="Tahoma" w:eastAsia="Tahoma"/>
+          <w:b w:val="0"/>
+          <w:sz w:val="22"/>
+          <w:rtl/>
+        </w:rPr>
+        <w:t>تنظيف git: إزالة ملفات الحالة والتقارير الملوّثة من التاريخ (-32,652 سطراً) + توسيع .gitignore (chat_history/login_session/db-sidecars/artifacts)</w:t>
+      </w:r>
+    </w:p>
+    <w:p>
+      <w:pPr>
+        <w:bidi/>
+        <w:spacing w:after="60"/>
+        <w:ind w:left="454"/>
+        <w:jc w:val="right"/>
+      </w:pPr>
+      <w:r>
+        <w:rPr>
+          <w:rFonts w:ascii="Tahoma" w:hAnsi="Tahoma" w:cs="Tahoma" w:eastAsia="Tahoma"/>
+          <w:b/>
+          <w:sz w:val="22"/>
+          <w:rtl/>
+        </w:rPr>
+        <w:t xml:space="preserve">• </w:t>
+      </w:r>
+      <w:r>
+        <w:rPr>
+          <w:rFonts w:ascii="Tahoma" w:hAnsi="Tahoma" w:cs="Tahoma" w:eastAsia="Tahoma"/>
+          <w:b w:val="0"/>
+          <w:sz w:val="22"/>
+          <w:rtl/>
+        </w:rPr>
+        <w:t>اختبارات أداء test_startup_perf.py (4): إقلاع 44ms + مشاهد 95-402ms + ذاكرة 45MB بحدود متسامحة</w:t>
+      </w:r>
+    </w:p>
+    <w:p>
+      <w:pPr>
+        <w:bidi/>
+        <w:spacing w:after="60"/>
+        <w:ind w:left="454"/>
+        <w:jc w:val="right"/>
+      </w:pPr>
+      <w:r>
+        <w:rPr>
+          <w:rFonts w:ascii="Tahoma" w:hAnsi="Tahoma" w:cs="Tahoma" w:eastAsia="Tahoma"/>
+          <w:b/>
+          <w:sz w:val="22"/>
+          <w:rtl/>
+        </w:rPr>
+        <w:t xml:space="preserve">• </w:t>
+      </w:r>
+      <w:r>
+        <w:rPr>
+          <w:rFonts w:ascii="Tahoma" w:hAnsi="Tahoma" w:cs="Tahoma" w:eastAsia="Tahoma"/>
+          <w:b w:val="0"/>
+          <w:sz w:val="22"/>
+          <w:rtl/>
+        </w:rPr>
+        <w:t>CI عبر GitHub Actions: ubuntu + Python 3.11 + xvfb-run pytest tests -q + تغطية معلوماتية فقط</w:t>
+      </w:r>
+    </w:p>
+    <w:p>
+      <w:pPr>
+        <w:bidi/>
+        <w:spacing w:after="60"/>
+        <w:ind w:left="454"/>
+        <w:jc w:val="right"/>
+      </w:pPr>
+      <w:r>
+        <w:rPr>
+          <w:rFonts w:ascii="Tahoma" w:hAnsi="Tahoma" w:cs="Tahoma" w:eastAsia="Tahoma"/>
+          <w:b/>
+          <w:sz w:val="22"/>
+          <w:rtl/>
+        </w:rPr>
+        <w:t xml:space="preserve">• </w:t>
+      </w:r>
+      <w:r>
+        <w:rPr>
+          <w:rFonts w:ascii="Tahoma" w:hAnsi="Tahoma" w:cs="Tahoma" w:eastAsia="Tahoma"/>
+          <w:b w:val="0"/>
+          <w:sz w:val="22"/>
+          <w:rtl/>
+        </w:rPr>
+        <w:t>تفكيك setup_ui الست العملاقة (350→27 / 261→15 / 224→28 / 217→31 / 212→24 / 192→9) إلى دوال _build_* — إعادة ترتيب صرفة بلا تغيير منطقي</w:t>
+      </w:r>
+    </w:p>
+    <w:p>
+      <w:pPr>
+        <w:bidi/>
+        <w:spacing w:after="60"/>
+        <w:ind w:left="454"/>
+        <w:jc w:val="right"/>
+      </w:pPr>
+      <w:r>
+        <w:rPr>
+          <w:rFonts w:ascii="Tahoma" w:hAnsi="Tahoma" w:cs="Tahoma" w:eastAsia="Tahoma"/>
+          <w:b/>
+          <w:sz w:val="22"/>
+          <w:rtl/>
+        </w:rPr>
+        <w:t xml:space="preserve">• </w:t>
+      </w:r>
+      <w:r>
+        <w:rPr>
+          <w:rFonts w:ascii="Tahoma" w:hAnsi="Tahoma" w:cs="Tahoma" w:eastAsia="Tahoma"/>
+          <w:b w:val="0"/>
+          <w:sz w:val="22"/>
+          <w:rtl/>
+        </w:rPr>
+        <w:t>طبقة تصدير موحدة ui/exporters.py (new_workbook/add_excel_sheet/ask_save_path/style_header_row/write_charts_pdf) + ترحيل 3 شاشات (لوحة التحكم المتقدمة/الرؤى الذكية/ربحية المراكز) −180 سطر boilerplate + 9 اختبارات</w:t>
+      </w:r>
+    </w:p>
+    <w:p>
+      <w:pPr>
+        <w:keepNext/>
+        <w:bidi/>
+        <w:spacing w:before="200" w:after="120"/>
+        <w:jc w:val="right"/>
+      </w:pPr>
+      <w:r>
+        <w:rPr>
+          <w:rFonts w:ascii="Tahoma" w:hAnsi="Tahoma" w:cs="Tahoma" w:eastAsia="Tahoma"/>
+          <w:b/>
+          <w:color w:val="1E3A5F"/>
+          <w:sz w:val="26"/>
+          <w:rtl/>
+        </w:rPr>
+        <w:t>13.15 تحسينات UI/UX</w:t>
       </w:r>
     </w:p>
     <w:p>
@@ -8632,7 +8780,7 @@
           <w:sz w:val="22"/>
           <w:rtl/>
         </w:rPr>
-        <w:t>1787 اختباراً ناجحاً مع تغطية 100% للوحدات</w:t>
+        <w:t>1800 اختباراً ناجحاً مع تغطية 100% للوحدات</w:t>
       </w:r>
     </w:p>
     <w:p>
@@ -8737,7 +8885,7 @@
           <w:sz w:val="22"/>
           <w:rtl/>
         </w:rPr>
-        <w:t>تم تطوير المشروع وفق أفضل ممارسات هندسة البرمجيات، مع الالتزام بمبادئ الجودة والاختبار المستمر، مما نتج عنه 1787 اختبار وحدة ناجحاً وتغطية 100% للوحدات. كما تم توفير نظام تحديث تلقائي لتسهيل عملية التطوير والصيانة المستمرة.</w:t>
+        <w:t>تم تطوير المشروع وفق أفضل ممارسات هندسة البرمجيات، مع الالتزام بمبادئ الجودة والاختبار المستمر، مما نتج عنه 1800 اختبار وحدة ناجحاً وتغطية 100% للوحدات. كما تم توفير نظام تحديث تلقائي لتسهيل عملية التطوير والصيانة المستمرة.</w:t>
       </w:r>
     </w:p>
     <w:p>

</xml_diff>

<commit_message>
v3.1.8: sidebar groups, UI standardization, report update, remember-me, settings encoding fix
- Sidebar reorganized into 6 groups (main/accounting/analysis/tax/tools/system)
- _go_to_view(view_id) mapping, all shortcuts use view IDs (1-35)
- settings_view.py restored from HEAD + 29 height/spacing edits (Arabic/French correct)
- tax_view.py: company_form WrapLongRows + AllNonFixedFieldsGrow
- tax_calendar_view.py: replaced MiniMax approach - ThemeColors instead of hardcoded hex, priority strip, no widget-level stylesheet
- login_session.py: encrypted AES-256-GCM remember-me session (session 80)
- test_login_remember.py: 29 tests added
- i18n: 2018 keys ×3 (nav_group_* added)
- tests updated: _go_to_view for UAT + fade safety
- Report v3.1.7→v3.1.8: 35 screens, 2018 i18n, 2020 tests, 37 modules, new sections 13.16-13.20, updated future works
- 2020 tests green
</commit_message>
<xml_diff>
--- a/docs/Smart_Accounting_Platform_Report.docx
+++ b/docs/Smart_Accounting_Platform_Report.docx
@@ -128,7 +128,7 @@
           <w:sz w:val="28"/>
           <w:rtl/>
         </w:rPr>
-        <w:t>الإصدار: v3.1.7</w:t>
+        <w:t>الإصدار: v3.1.8</w:t>
       </w:r>
     </w:p>
     <w:p>
@@ -532,7 +532,7 @@
           <w:sz w:val="22"/>
           <w:rtl/>
         </w:rPr>
-        <w:t>وصل المشروع إلى الإصدار v3.1.7 بعد جلسات تطوير متتالية أضافت ميزات متقدمة شملت تحليل DuPont، تحليل السيناريوهات، المعايير المرجعية، لوحة التحكم المتقدمة، الامتثال الضريبي الكامل، محرك الرؤى الذكية، تحليل مراكز التكلفة، تعدد العملات، المزامنة السحابية، الشركات التجريبية، واختبار UAT شامل (1787 اختباراً ناجحاً).</w:t>
+        <w:t>وصل المشروع إلى الإصدار v3.1.7 بعد جلسات تطوير متتالية أضافت ميزات متقدمة شملت تحليل DuPont، تحليل السيناريوهات، المعايير المرجعية، لوحة التحكم المتقدمة، الامتثال الضريبي الكامل، محرك الرؤى الذكية، تحليل مراكز التكلفة، تعدد العملات، المزامنة السحابية، الشركات التجريبية، واختبار UAT شامل (2020 اختباراً ناجحاً).</w:t>
       </w:r>
     </w:p>
     <w:p>
@@ -866,7 +866,7 @@
           <w:sz w:val="22"/>
           <w:rtl/>
         </w:rPr>
-        <w:t>د. توفير 28 شاشة تفاعلية بواجهة سهلة الاستخدام مع اختصارات لوحة مفاتيح كاملة</w:t>
+        <w:t>د. توفير 35 شاشة تفاعلية بواجهة سهلة الاستخدام مع اختصارات لوحة مفاتيح كاملة</w:t>
       </w:r>
     </w:p>
     <w:p>
@@ -892,7 +892,7 @@
           <w:sz w:val="22"/>
           <w:rtl/>
         </w:rPr>
-        <w:t>هـ. دعم 3 لغات: العربية، الإنجليزية، الفرنسية مع تبديل فوري (1530 مفتاحاً للترجمة)</w:t>
+        <w:t>هـ. دعم 3 لغات: العربية، الإنجليزية، الفرنسية مع تبديل فوري (2018 مفتاحاً للترجمة)</w:t>
       </w:r>
     </w:p>
     <w:p>
@@ -970,7 +970,7 @@
           <w:sz w:val="22"/>
           <w:rtl/>
         </w:rPr>
-        <w:t>ح. توفير 1800 اختبار وحدة ناجحاً مع تغطية 100% للوحدات البرمجية</w:t>
+        <w:t>ح. توفير 2020 اختبار وحدة ناجحاً مع تغطية 100% للوحدات البرمجية</w:t>
       </w:r>
     </w:p>
     <w:p>
@@ -1457,7 +1457,7 @@
           <w:sz w:val="22"/>
           <w:rtl/>
         </w:rPr>
-        <w:t>4. تطوير واجهات المستخدم (28 شاشة)</w:t>
+        <w:t>4. تطوير واجهات المستخدم (35 شاشة)</w:t>
       </w:r>
     </w:p>
     <w:p>
@@ -1535,7 +1535,7 @@
           <w:sz w:val="22"/>
           <w:rtl/>
         </w:rPr>
-        <w:t>7. الاختبار والتحسين المستمر (1800 اختباراً + تغطية 100%)</w:t>
+        <w:t>7. الاختبار والتحسين المستمر (2020 اختباراً + تغطية 100%)</w:t>
       </w:r>
     </w:p>
     <w:p>
@@ -1642,7 +1642,7 @@
           <w:sz w:val="22"/>
           <w:rtl/>
         </w:rPr>
-        <w:t>طبقة العرض (UI): 28 شاشة عبر PyQt5 مع تحميل كسول (Lazy Loading)</w:t>
+        <w:t>طبقة العرض (UI): 35 شاشة عبر PyQt5 مع تحميل كسول (Lazy Loading)</w:t>
       </w:r>
     </w:p>
     <w:p>
@@ -1668,7 +1668,7 @@
           <w:sz w:val="22"/>
           <w:rtl/>
         </w:rPr>
-        <w:t>طبقة المنطق التجاري (Modules): أكثر من 25 وحدة برمجية متخصصة</w:t>
+        <w:t>طبقة المنطق التجاري (Modules): أكثر من 37 وحدة برمجية متخصصة</w:t>
       </w:r>
     </w:p>
     <w:p>
@@ -1902,7 +1902,7 @@
           <w:sz w:val="22"/>
           <w:rtl/>
         </w:rPr>
-        <w:t>يتم إنشاء MainWindow (QMainWindow) عند بدء التشغيل. تحتوي على QStackedWidget يضم 28 شاشة (QWidget). التنقل بين الشاشات يتم عبر QListWidget جانبي. يتم تحميل الشاشات عند الطلب (Lazy Loading) لتحسين الأداء.</w:t>
+        <w:t>يتم إنشاء MainWindow (QMainWindow) عند بدء التشغيل. تحتوي على QStackedWidget يضم 35 شاشة (QWidget). التنقل بين الشاشات يتم عبر QListWidget جانبي. يتم تحميل الشاشات عند الطلب (Lazy Loading) لتحسين الأداء.</w:t>
       </w:r>
     </w:p>
     <w:p>
@@ -2093,7 +2093,7 @@
           <w:sz w:val="22"/>
           <w:rtl/>
         </w:rPr>
-        <w:t>مترجم Python يحول الكود إلى C ثم يجمعه إلى ملف تنفيذي. أنتج نسخة مستقلة (Standalone EXE) حجمها 133MB. تم تحسين الإقلاع من 778ms إلى 49ms وتقليل استهلاك الذاكرة من 128MB إلى 45MB.</w:t>
+        <w:t>مترجم Python يحول الكود إلى C ثم يجمعه إلى ملف تنفيذي. أنتج نسخة مستقلة (Standalone EXE) حجمها 143MB. تم تحسين الإقلاع من 778ms إلى 44ms وتقليل استهلاك الذاكرة من 128MB إلى 45MB.</w:t>
       </w:r>
     </w:p>
     <w:p>
@@ -2127,7 +2127,7 @@
           <w:sz w:val="22"/>
           <w:rtl/>
         </w:rPr>
-        <w:t>أداة إنشاء مثبتات Windows. توزّع التطبيق بمثبت حجمه 63.2MB ونسخة ZIP بحجم 41.4MB. الميزات: AppMutex لضمان إغلاق التطبيق، CloseApplications=force، وتحديث صامت.</w:t>
+        <w:t>أداة إنشاء مثبتات Windows. توزّع التطبيق بمثبت حجمه 66.9MB ونسخة ZIP بحجم 109.4MB. الميزات: AppMutex لضمان إغلاق التطبيق، CloseApplications=force، وتحديث صامت.</w:t>
       </w:r>
     </w:p>
     <w:p>
@@ -3401,6 +3401,214 @@
     </w:p>
     <w:p>
       <w:pPr>
+        <w:bidi/>
+        <w:spacing w:after="60"/>
+        <w:ind w:left="454"/>
+        <w:jc w:val="right"/>
+      </w:pPr>
+      <w:r>
+        <w:rPr>
+          <w:rFonts w:ascii="Tahoma" w:hAnsi="Tahoma" w:cs="Tahoma" w:eastAsia="Tahoma"/>
+          <w:b/>
+          <w:sz w:val="22"/>
+          <w:rtl/>
+        </w:rPr>
+        <w:t xml:space="preserve">• </w:t>
+      </w:r>
+      <w:r>
+        <w:rPr>
+          <w:rFonts w:ascii="Tahoma" w:hAnsi="Tahoma" w:cs="Tahoma" w:eastAsia="Tahoma"/>
+          <w:b w:val="0"/>
+          <w:sz w:val="22"/>
+          <w:rtl/>
+        </w:rPr>
+        <w:t>modules/ledger.py: ميزان المراجعة والأستاذ العام (شاشة 30)</w:t>
+      </w:r>
+    </w:p>
+    <w:p>
+      <w:pPr>
+        <w:bidi/>
+        <w:spacing w:after="60"/>
+        <w:ind w:left="454"/>
+        <w:jc w:val="right"/>
+      </w:pPr>
+      <w:r>
+        <w:rPr>
+          <w:rFonts w:ascii="Tahoma" w:hAnsi="Tahoma" w:cs="Tahoma" w:eastAsia="Tahoma"/>
+          <w:b/>
+          <w:sz w:val="22"/>
+          <w:rtl/>
+        </w:rPr>
+        <w:t xml:space="preserve">• </w:t>
+      </w:r>
+      <w:r>
+        <w:rPr>
+          <w:rFonts w:ascii="Tahoma" w:hAnsi="Tahoma" w:cs="Tahoma" w:eastAsia="Tahoma"/>
+          <w:b w:val="0"/>
+          <w:sz w:val="22"/>
+          <w:rtl/>
+        </w:rPr>
+        <w:t>modules/partners.py: تقادم ديون العملاء والموردين (شاشة 31)</w:t>
+      </w:r>
+    </w:p>
+    <w:p>
+      <w:pPr>
+        <w:bidi/>
+        <w:spacing w:after="60"/>
+        <w:ind w:left="454"/>
+        <w:jc w:val="right"/>
+      </w:pPr>
+      <w:r>
+        <w:rPr>
+          <w:rFonts w:ascii="Tahoma" w:hAnsi="Tahoma" w:cs="Tahoma" w:eastAsia="Tahoma"/>
+          <w:b/>
+          <w:sz w:val="22"/>
+          <w:rtl/>
+        </w:rPr>
+        <w:t xml:space="preserve">• </w:t>
+      </w:r>
+      <w:r>
+        <w:rPr>
+          <w:rFonts w:ascii="Tahoma" w:hAnsi="Tahoma" w:cs="Tahoma" w:eastAsia="Tahoma"/>
+          <w:b w:val="0"/>
+          <w:sz w:val="22"/>
+          <w:rtl/>
+        </w:rPr>
+        <w:t>modules/invoicing.py: إدارة الفواتير وحساب TVA (شاشة 32)</w:t>
+      </w:r>
+    </w:p>
+    <w:p>
+      <w:pPr>
+        <w:bidi/>
+        <w:spacing w:after="60"/>
+        <w:ind w:left="454"/>
+        <w:jc w:val="right"/>
+      </w:pPr>
+      <w:r>
+        <w:rPr>
+          <w:rFonts w:ascii="Tahoma" w:hAnsi="Tahoma" w:cs="Tahoma" w:eastAsia="Tahoma"/>
+          <w:b/>
+          <w:sz w:val="22"/>
+          <w:rtl/>
+        </w:rPr>
+        <w:t xml:space="preserve">• </w:t>
+      </w:r>
+      <w:r>
+        <w:rPr>
+          <w:rFonts w:ascii="Tahoma" w:hAnsi="Tahoma" w:cs="Tahoma" w:eastAsia="Tahoma"/>
+          <w:b w:val="0"/>
+          <w:sz w:val="22"/>
+          <w:rtl/>
+        </w:rPr>
+        <w:t>modules/inventory.py: إدارة المخزون بمتوسط التكلفة (شاشة 33)</w:t>
+      </w:r>
+    </w:p>
+    <w:p>
+      <w:pPr>
+        <w:bidi/>
+        <w:spacing w:after="60"/>
+        <w:ind w:left="454"/>
+        <w:jc w:val="right"/>
+      </w:pPr>
+      <w:r>
+        <w:rPr>
+          <w:rFonts w:ascii="Tahoma" w:hAnsi="Tahoma" w:cs="Tahoma" w:eastAsia="Tahoma"/>
+          <w:b/>
+          <w:sz w:val="22"/>
+          <w:rtl/>
+        </w:rPr>
+        <w:t xml:space="preserve">• </w:t>
+      </w:r>
+      <w:r>
+        <w:rPr>
+          <w:rFonts w:ascii="Tahoma" w:hAnsi="Tahoma" w:cs="Tahoma" w:eastAsia="Tahoma"/>
+          <w:b w:val="0"/>
+          <w:sz w:val="22"/>
+          <w:rtl/>
+        </w:rPr>
+        <w:t>modules/payroll.py: كشف الرواتب CNAS+IRG (شاشة 34)</w:t>
+      </w:r>
+    </w:p>
+    <w:p>
+      <w:pPr>
+        <w:bidi/>
+        <w:spacing w:after="60"/>
+        <w:ind w:left="454"/>
+        <w:jc w:val="right"/>
+      </w:pPr>
+      <w:r>
+        <w:rPr>
+          <w:rFonts w:ascii="Tahoma" w:hAnsi="Tahoma" w:cs="Tahoma" w:eastAsia="Tahoma"/>
+          <w:b/>
+          <w:sz w:val="22"/>
+          <w:rtl/>
+        </w:rPr>
+        <w:t xml:space="preserve">• </w:t>
+      </w:r>
+      <w:r>
+        <w:rPr>
+          <w:rFonts w:ascii="Tahoma" w:hAnsi="Tahoma" w:cs="Tahoma" w:eastAsia="Tahoma"/>
+          <w:b w:val="0"/>
+          <w:sz w:val="22"/>
+          <w:rtl/>
+        </w:rPr>
+        <w:t>modules/budgeting.py: مقارنة الميزانية الفعلية والمخطط (شاشة 35)</w:t>
+      </w:r>
+    </w:p>
+    <w:p>
+      <w:pPr>
+        <w:bidi/>
+        <w:spacing w:after="60"/>
+        <w:ind w:left="454"/>
+        <w:jc w:val="right"/>
+      </w:pPr>
+      <w:r>
+        <w:rPr>
+          <w:rFonts w:ascii="Tahoma" w:hAnsi="Tahoma" w:cs="Tahoma" w:eastAsia="Tahoma"/>
+          <w:b/>
+          <w:sz w:val="22"/>
+          <w:rtl/>
+        </w:rPr>
+        <w:t xml:space="preserve">• </w:t>
+      </w:r>
+      <w:r>
+        <w:rPr>
+          <w:rFonts w:ascii="Tahoma" w:hAnsi="Tahoma" w:cs="Tahoma" w:eastAsia="Tahoma"/>
+          <w:b w:val="0"/>
+          <w:sz w:val="22"/>
+          <w:rtl/>
+        </w:rPr>
+        <w:t>modules/tax_years.py: إدارة سنوات النظام الجبائي (2025/2026/... مع تحقق وتصدير)</w:t>
+      </w:r>
+    </w:p>
+    <w:p>
+      <w:pPr>
+        <w:bidi/>
+        <w:spacing w:after="60"/>
+        <w:ind w:left="454"/>
+        <w:jc w:val="right"/>
+      </w:pPr>
+      <w:r>
+        <w:rPr>
+          <w:rFonts w:ascii="Tahoma" w:hAnsi="Tahoma" w:cs="Tahoma" w:eastAsia="Tahoma"/>
+          <w:b/>
+          <w:sz w:val="22"/>
+          <w:rtl/>
+        </w:rPr>
+        <w:t xml:space="preserve">• </w:t>
+      </w:r>
+      <w:r>
+        <w:rPr>
+          <w:rFonts w:ascii="Tahoma" w:hAnsi="Tahoma" w:cs="Tahoma" w:eastAsia="Tahoma"/>
+          <w:b w:val="0"/>
+          <w:sz w:val="22"/>
+          <w:rtl/>
+        </w:rPr>
+        <w:t>modules/commercial/: الترخيص والتشفير وطبقات الاستخدام (RSA-2048 + Argon2id + بوابة الميزات)</w:t>
+      </w:r>
+    </w:p>
+    <w:p>
+      <w:pPr>
         <w:keepNext/>
         <w:bidi/>
         <w:spacing w:before="280" w:after="160"/>
@@ -3433,7 +3641,7 @@
           <w:sz w:val="22"/>
           <w:rtl/>
         </w:rPr>
-        <w:t>يحتوي النظام على 28 شاشة تفاعلية بواجهة سهلة الاستخدام، مع دعم كامل للغة العربية من اليمين لليسار (RTL).</w:t>
+        <w:t>يحتوي النظام على 35 شاشة تفاعلية بواجهة سهلة الاستخدام، مع دعم كامل للغة العربية من اليمين لليسار (RTL).</w:t>
       </w:r>
     </w:p>
     <w:p>
@@ -3477,7 +3685,7 @@
           <w:sz w:val="22"/>
           <w:rtl/>
         </w:rPr>
-        <w:t>دعم 3 لغات (عربي RTL، إنجليزي LTR، فرنسي LTR) مع تبديل فوري (1530 مفتاح ترجمة)</w:t>
+        <w:t>دعم 3 لغات (عربي RTL، إنجليزي LTR، فرنسي LTR) مع تبديل فوري (2018 مفتاح ترجمة)</w:t>
       </w:r>
     </w:p>
     <w:p>
@@ -3529,7 +3737,7 @@
           <w:sz w:val="22"/>
           <w:rtl/>
         </w:rPr>
-        <w:t>اختصارات كاملة: Ctrl+1..0 و Ctrl+Shift+1..0 و F2..F8 للشاشات 21-28 و Ctrl+T للثيم و F1 للاختصارات</w:t>
+        <w:t>اختصارات كاملة: Ctrl+1..0 و Ctrl+Shift+1..0 و F2..F12 للشاشات 21-35 و Ctrl+T للثيم و F1 للاختصارات</w:t>
       </w:r>
     </w:p>
     <w:p>
@@ -3555,7 +3763,7 @@
           <w:sz w:val="22"/>
           <w:rtl/>
         </w:rPr>
-        <w:t>قائمة عرض (View) ديناميكية بكل الشاشات 28</w:t>
+        <w:t>قائمة عرض (View) ديناميكية بكل الشاشات 35</w:t>
       </w:r>
     </w:p>
     <w:p>
@@ -3651,7 +3859,7 @@
           <w:sz w:val="26"/>
           <w:rtl/>
         </w:rPr>
-        <w:t>10.2 الشاشات الـ28</w:t>
+        <w:t>10.2 الشاشات الـ35</w:t>
       </w:r>
     </w:p>
     <w:tbl>
@@ -3816,7 +4024,7 @@
                 <w:sz w:val="20"/>
                 <w:rtl/>
               </w:rPr>
-              <w:t>15</w:t>
+              <w:t>19</w:t>
             </w:r>
           </w:p>
         </w:tc>
@@ -3837,7 +4045,7 @@
                 <w:sz w:val="20"/>
                 <w:rtl/>
               </w:rPr>
-              <w:t>المعايير المرجعية</w:t>
+              <w:t>الطباعة والتصدير</w:t>
             </w:r>
           </w:p>
         </w:tc>
@@ -3902,7 +4110,7 @@
                 <w:sz w:val="20"/>
                 <w:rtl/>
               </w:rPr>
-              <w:t>16</w:t>
+              <w:t>20</w:t>
             </w:r>
           </w:p>
         </w:tc>
@@ -3923,7 +4131,7 @@
                 <w:sz w:val="20"/>
                 <w:rtl/>
               </w:rPr>
-              <w:t>مخطط الحسابات</w:t>
+              <w:t>نقطة التعادل</w:t>
             </w:r>
           </w:p>
         </w:tc>
@@ -3967,7 +4175,7 @@
                 <w:sz w:val="20"/>
                 <w:rtl/>
               </w:rPr>
-              <w:t>النسب المالية (20 نسبة + Z-Score)</w:t>
+              <w:t>النسب المالية (20 + Z-Score)</w:t>
             </w:r>
           </w:p>
         </w:tc>
@@ -3988,7 +4196,7 @@
                 <w:sz w:val="20"/>
                 <w:rtl/>
               </w:rPr>
-              <w:t>17</w:t>
+              <w:t>21</w:t>
             </w:r>
           </w:p>
         </w:tc>
@@ -4009,7 +4217,7 @@
                 <w:sz w:val="20"/>
                 <w:rtl/>
               </w:rPr>
-              <w:t>البنك</w:t>
+              <w:t>مراكز التكلفة</w:t>
             </w:r>
           </w:p>
         </w:tc>
@@ -4053,7 +4261,7 @@
                 <w:sz w:val="20"/>
                 <w:rtl/>
               </w:rPr>
-              <w:t>التقويم الجبائي</w:t>
+              <w:t>التقارير المحفوظة</w:t>
             </w:r>
           </w:p>
         </w:tc>
@@ -4074,7 +4282,7 @@
                 <w:sz w:val="20"/>
                 <w:rtl/>
               </w:rPr>
-              <w:t>18</w:t>
+              <w:t>22</w:t>
             </w:r>
           </w:p>
         </w:tc>
@@ -4095,7 +4303,7 @@
                 <w:sz w:val="20"/>
                 <w:rtl/>
               </w:rPr>
-              <w:t>التقارير</w:t>
+              <w:t>مقارنة الميزانية</w:t>
             </w:r>
           </w:p>
         </w:tc>
@@ -4139,7 +4347,7 @@
                 <w:sz w:val="20"/>
                 <w:rtl/>
               </w:rPr>
-              <w:t>الطباعة</w:t>
+              <w:t>النسخ الاحتياطي</w:t>
             </w:r>
           </w:p>
         </w:tc>
@@ -4160,7 +4368,7 @@
                 <w:sz w:val="20"/>
                 <w:rtl/>
               </w:rPr>
-              <w:t>19</w:t>
+              <w:t>23</w:t>
             </w:r>
           </w:p>
         </w:tc>
@@ -4181,7 +4389,7 @@
                 <w:sz w:val="20"/>
                 <w:rtl/>
               </w:rPr>
-              <w:t>النسخ الاحتياطي</w:t>
+              <w:t>لوحة التحكم المتقدمة</w:t>
             </w:r>
           </w:p>
         </w:tc>
@@ -4225,7 +4433,7 @@
                 <w:sz w:val="20"/>
                 <w:rtl/>
               </w:rPr>
-              <w:t>تحليل DuPont المتقدم</w:t>
+              <w:t>استيراد البيانات</w:t>
             </w:r>
           </w:p>
         </w:tc>
@@ -4246,7 +4454,7 @@
                 <w:sz w:val="20"/>
                 <w:rtl/>
               </w:rPr>
-              <w:t>20</w:t>
+              <w:t>24</w:t>
             </w:r>
           </w:p>
         </w:tc>
@@ -4267,7 +4475,7 @@
                 <w:sz w:val="20"/>
                 <w:rtl/>
               </w:rPr>
-              <w:t>الاستيراد</w:t>
+              <w:t>الرؤى الذكية AI</w:t>
             </w:r>
           </w:p>
         </w:tc>
@@ -4311,7 +4519,7 @@
                 <w:sz w:val="20"/>
                 <w:rtl/>
               </w:rPr>
-              <w:t>تحليل السيناريوهات</w:t>
+              <w:t>الإعدادات</w:t>
             </w:r>
           </w:p>
         </w:tc>
@@ -4332,7 +4540,7 @@
                 <w:sz w:val="20"/>
                 <w:rtl/>
               </w:rPr>
-              <w:t>21</w:t>
+              <w:t>25</w:t>
             </w:r>
           </w:p>
         </w:tc>
@@ -4353,7 +4561,7 @@
                 <w:sz w:val="20"/>
                 <w:rtl/>
               </w:rPr>
-              <w:t>التنبؤ المالي</w:t>
+              <w:t>ربحية مراكز التكلفة</w:t>
             </w:r>
           </w:p>
         </w:tc>
@@ -4397,7 +4605,7 @@
                 <w:sz w:val="20"/>
                 <w:rtl/>
               </w:rPr>
-              <w:t>لوحة التحكم المتقدمة</w:t>
+              <w:t>المستخدمون</w:t>
             </w:r>
           </w:p>
         </w:tc>
@@ -4418,7 +4626,7 @@
                 <w:sz w:val="20"/>
                 <w:rtl/>
               </w:rPr>
-              <w:t>22</w:t>
+              <w:t>26</w:t>
             </w:r>
           </w:p>
         </w:tc>
@@ -4439,7 +4647,7 @@
                 <w:sz w:val="20"/>
                 <w:rtl/>
               </w:rPr>
-              <w:t>مراكز التكلفة</w:t>
+              <w:t>تعدد العملات</w:t>
             </w:r>
           </w:p>
         </w:tc>
@@ -4483,7 +4691,7 @@
                 <w:sz w:val="20"/>
                 <w:rtl/>
               </w:rPr>
-              <w:t>محرك الرؤى الذكية AI</w:t>
+              <w:t>النظام الجبائي</w:t>
             </w:r>
           </w:p>
         </w:tc>
@@ -4504,7 +4712,7 @@
                 <w:sz w:val="20"/>
                 <w:rtl/>
               </w:rPr>
-              <w:t>23</w:t>
+              <w:t>27</w:t>
             </w:r>
           </w:p>
         </w:tc>
@@ -4525,7 +4733,7 @@
                 <w:sz w:val="20"/>
                 <w:rtl/>
               </w:rPr>
-              <w:t>تعدد العملات</w:t>
+              <w:t>المزامنة السحابية</w:t>
             </w:r>
           </w:p>
         </w:tc>
@@ -4569,7 +4777,7 @@
                 <w:sz w:val="20"/>
                 <w:rtl/>
               </w:rPr>
-              <w:t>مراكز التكلفة الربحية</w:t>
+              <w:t>التقويم الجبائي</w:t>
             </w:r>
           </w:p>
         </w:tc>
@@ -4590,7 +4798,7 @@
                 <w:sz w:val="20"/>
                 <w:rtl/>
               </w:rPr>
-              <w:t>24</w:t>
+              <w:t>28</w:t>
             </w:r>
           </w:p>
         </w:tc>
@@ -4611,7 +4819,7 @@
                 <w:sz w:val="20"/>
                 <w:rtl/>
               </w:rPr>
-              <w:t>المزامنة السحابية</w:t>
+              <w:t>الشركات التجريبية</w:t>
             </w:r>
           </w:p>
         </w:tc>
@@ -4655,7 +4863,7 @@
                 <w:sz w:val="20"/>
                 <w:rtl/>
               </w:rPr>
-              <w:t>الشركات التجريبية</w:t>
+              <w:t>التدقيق والمراجعة</w:t>
             </w:r>
           </w:p>
         </w:tc>
@@ -4676,7 +4884,7 @@
                 <w:sz w:val="20"/>
                 <w:rtl/>
               </w:rPr>
-              <w:t>25</w:t>
+              <w:t>29</w:t>
             </w:r>
           </w:p>
         </w:tc>
@@ -4697,7 +4905,7 @@
                 <w:sz w:val="20"/>
                 <w:rtl/>
               </w:rPr>
-              <w:t>المستخدمون</w:t>
+              <w:t>اختبار المستخدمين</w:t>
             </w:r>
           </w:p>
         </w:tc>
@@ -4741,7 +4949,7 @@
                 <w:sz w:val="20"/>
                 <w:rtl/>
               </w:rPr>
-              <w:t>التقارير الضريبية</w:t>
+              <w:t>الأمان والمصادقة</w:t>
             </w:r>
           </w:p>
         </w:tc>
@@ -4762,7 +4970,7 @@
                 <w:sz w:val="20"/>
                 <w:rtl/>
               </w:rPr>
-              <w:t>26</w:t>
+              <w:t>30</w:t>
             </w:r>
           </w:p>
         </w:tc>
@@ -4783,7 +4991,7 @@
                 <w:sz w:val="20"/>
                 <w:rtl/>
               </w:rPr>
-              <w:t>الإعدادات</w:t>
+              <w:t>ميزان المراجعة</w:t>
             </w:r>
           </w:p>
         </w:tc>
@@ -4827,7 +5035,7 @@
                 <w:sz w:val="20"/>
                 <w:rtl/>
               </w:rPr>
-              <w:t>البيانات المالية</w:t>
+              <w:t>مركز المساعدة</w:t>
             </w:r>
           </w:p>
         </w:tc>
@@ -4848,7 +5056,7 @@
                 <w:sz w:val="20"/>
                 <w:rtl/>
               </w:rPr>
-              <w:t>27</w:t>
+              <w:t>31</w:t>
             </w:r>
           </w:p>
         </w:tc>
@@ -4869,7 +5077,7 @@
                 <w:sz w:val="20"/>
                 <w:rtl/>
               </w:rPr>
-              <w:t>مركز المساعدة</w:t>
+              <w:t>الشركاء والعملاء</w:t>
             </w:r>
           </w:p>
         </w:tc>
@@ -4913,6 +5121,350 @@
                 <w:sz w:val="20"/>
                 <w:rtl/>
               </w:rPr>
+              <w:t>التنبؤ المالي</w:t>
+            </w:r>
+          </w:p>
+        </w:tc>
+        <w:tc>
+          <w:tcPr>
+            <w:tcW w:type="dxa" w:w="680"/>
+          </w:tcPr>
+          <w:p>
+            <w:pPr>
+              <w:bidi/>
+              <w:spacing w:after="40"/>
+              <w:jc w:val="right"/>
+            </w:pPr>
+            <w:r>
+              <w:rPr>
+                <w:rFonts w:ascii="Tahoma" w:hAnsi="Tahoma" w:cs="Tahoma" w:eastAsia="Tahoma"/>
+                <w:b w:val="0"/>
+                <w:sz w:val="20"/>
+                <w:rtl/>
+              </w:rPr>
+              <w:t>32</w:t>
+            </w:r>
+          </w:p>
+        </w:tc>
+        <w:tc>
+          <w:tcPr>
+            <w:tcW w:type="dxa" w:w="3969"/>
+          </w:tcPr>
+          <w:p>
+            <w:pPr>
+              <w:bidi/>
+              <w:spacing w:after="40"/>
+              <w:jc w:val="right"/>
+            </w:pPr>
+            <w:r>
+              <w:rPr>
+                <w:rFonts w:ascii="Tahoma" w:hAnsi="Tahoma" w:cs="Tahoma" w:eastAsia="Tahoma"/>
+                <w:b w:val="0"/>
+                <w:sz w:val="20"/>
+                <w:rtl/>
+              </w:rPr>
+              <w:t>الفواتير</w:t>
+            </w:r>
+          </w:p>
+        </w:tc>
+      </w:tr>
+      <w:tr>
+        <w:tc>
+          <w:tcPr>
+            <w:tcW w:type="dxa" w:w="680"/>
+          </w:tcPr>
+          <w:p>
+            <w:pPr>
+              <w:bidi/>
+              <w:spacing w:after="40"/>
+              <w:jc w:val="right"/>
+            </w:pPr>
+            <w:r>
+              <w:rPr>
+                <w:rFonts w:ascii="Tahoma" w:hAnsi="Tahoma" w:cs="Tahoma" w:eastAsia="Tahoma"/>
+                <w:b w:val="0"/>
+                <w:sz w:val="20"/>
+                <w:rtl/>
+              </w:rPr>
+              <w:t>15</w:t>
+            </w:r>
+          </w:p>
+        </w:tc>
+        <w:tc>
+          <w:tcPr>
+            <w:tcW w:type="dxa" w:w="3969"/>
+          </w:tcPr>
+          <w:p>
+            <w:pPr>
+              <w:bidi/>
+              <w:spacing w:after="40"/>
+              <w:jc w:val="right"/>
+            </w:pPr>
+            <w:r>
+              <w:rPr>
+                <w:rFonts w:ascii="Tahoma" w:hAnsi="Tahoma" w:cs="Tahoma" w:eastAsia="Tahoma"/>
+                <w:b w:val="0"/>
+                <w:sz w:val="20"/>
+                <w:rtl/>
+              </w:rPr>
+              <w:t>المعايير المرجعية</w:t>
+            </w:r>
+          </w:p>
+        </w:tc>
+        <w:tc>
+          <w:tcPr>
+            <w:tcW w:type="dxa" w:w="680"/>
+          </w:tcPr>
+          <w:p>
+            <w:pPr>
+              <w:bidi/>
+              <w:spacing w:after="40"/>
+              <w:jc w:val="right"/>
+            </w:pPr>
+            <w:r>
+              <w:rPr>
+                <w:rFonts w:ascii="Tahoma" w:hAnsi="Tahoma" w:cs="Tahoma" w:eastAsia="Tahoma"/>
+                <w:b w:val="0"/>
+                <w:sz w:val="20"/>
+                <w:rtl/>
+              </w:rPr>
+              <w:t>33</w:t>
+            </w:r>
+          </w:p>
+        </w:tc>
+        <w:tc>
+          <w:tcPr>
+            <w:tcW w:type="dxa" w:w="3969"/>
+          </w:tcPr>
+          <w:p>
+            <w:pPr>
+              <w:bidi/>
+              <w:spacing w:after="40"/>
+              <w:jc w:val="right"/>
+            </w:pPr>
+            <w:r>
+              <w:rPr>
+                <w:rFonts w:ascii="Tahoma" w:hAnsi="Tahoma" w:cs="Tahoma" w:eastAsia="Tahoma"/>
+                <w:b w:val="0"/>
+                <w:sz w:val="20"/>
+                <w:rtl/>
+              </w:rPr>
+              <w:t>المخزون</w:t>
+            </w:r>
+          </w:p>
+        </w:tc>
+      </w:tr>
+      <w:tr>
+        <w:tc>
+          <w:tcPr>
+            <w:tcW w:type="dxa" w:w="680"/>
+          </w:tcPr>
+          <w:p>
+            <w:pPr>
+              <w:bidi/>
+              <w:spacing w:after="40"/>
+              <w:jc w:val="right"/>
+            </w:pPr>
+            <w:r>
+              <w:rPr>
+                <w:rFonts w:ascii="Tahoma" w:hAnsi="Tahoma" w:cs="Tahoma" w:eastAsia="Tahoma"/>
+                <w:b w:val="0"/>
+                <w:sz w:val="20"/>
+                <w:rtl/>
+              </w:rPr>
+              <w:t>16</w:t>
+            </w:r>
+          </w:p>
+        </w:tc>
+        <w:tc>
+          <w:tcPr>
+            <w:tcW w:type="dxa" w:w="3969"/>
+          </w:tcPr>
+          <w:p>
+            <w:pPr>
+              <w:bidi/>
+              <w:spacing w:after="40"/>
+              <w:jc w:val="right"/>
+            </w:pPr>
+            <w:r>
+              <w:rPr>
+                <w:rFonts w:ascii="Tahoma" w:hAnsi="Tahoma" w:cs="Tahoma" w:eastAsia="Tahoma"/>
+                <w:b w:val="0"/>
+                <w:sz w:val="20"/>
+                <w:rtl/>
+              </w:rPr>
+              <w:t>تحليل السيناريوهات</w:t>
+            </w:r>
+          </w:p>
+        </w:tc>
+        <w:tc>
+          <w:tcPr>
+            <w:tcW w:type="dxa" w:w="680"/>
+          </w:tcPr>
+          <w:p>
+            <w:pPr>
+              <w:bidi/>
+              <w:spacing w:after="40"/>
+              <w:jc w:val="right"/>
+            </w:pPr>
+            <w:r>
+              <w:rPr>
+                <w:rFonts w:ascii="Tahoma" w:hAnsi="Tahoma" w:cs="Tahoma" w:eastAsia="Tahoma"/>
+                <w:b w:val="0"/>
+                <w:sz w:val="20"/>
+                <w:rtl/>
+              </w:rPr>
+              <w:t>34</w:t>
+            </w:r>
+          </w:p>
+        </w:tc>
+        <w:tc>
+          <w:tcPr>
+            <w:tcW w:type="dxa" w:w="3969"/>
+          </w:tcPr>
+          <w:p>
+            <w:pPr>
+              <w:bidi/>
+              <w:spacing w:after="40"/>
+              <w:jc w:val="right"/>
+            </w:pPr>
+            <w:r>
+              <w:rPr>
+                <w:rFonts w:ascii="Tahoma" w:hAnsi="Tahoma" w:cs="Tahoma" w:eastAsia="Tahoma"/>
+                <w:b w:val="0"/>
+                <w:sz w:val="20"/>
+                <w:rtl/>
+              </w:rPr>
+              <w:t>الرواتب والأجور</w:t>
+            </w:r>
+          </w:p>
+        </w:tc>
+      </w:tr>
+      <w:tr>
+        <w:tc>
+          <w:tcPr>
+            <w:tcW w:type="dxa" w:w="680"/>
+          </w:tcPr>
+          <w:p>
+            <w:pPr>
+              <w:bidi/>
+              <w:spacing w:after="40"/>
+              <w:jc w:val="right"/>
+            </w:pPr>
+            <w:r>
+              <w:rPr>
+                <w:rFonts w:ascii="Tahoma" w:hAnsi="Tahoma" w:cs="Tahoma" w:eastAsia="Tahoma"/>
+                <w:b w:val="0"/>
+                <w:sz w:val="20"/>
+                <w:rtl/>
+              </w:rPr>
+              <w:t>17</w:t>
+            </w:r>
+          </w:p>
+        </w:tc>
+        <w:tc>
+          <w:tcPr>
+            <w:tcW w:type="dxa" w:w="3969"/>
+          </w:tcPr>
+          <w:p>
+            <w:pPr>
+              <w:bidi/>
+              <w:spacing w:after="40"/>
+              <w:jc w:val="right"/>
+            </w:pPr>
+            <w:r>
+              <w:rPr>
+                <w:rFonts w:ascii="Tahoma" w:hAnsi="Tahoma" w:cs="Tahoma" w:eastAsia="Tahoma"/>
+                <w:b w:val="0"/>
+                <w:sz w:val="20"/>
+                <w:rtl/>
+              </w:rPr>
+              <w:t>التدفقات النقدية</w:t>
+            </w:r>
+          </w:p>
+        </w:tc>
+        <w:tc>
+          <w:tcPr>
+            <w:tcW w:type="dxa" w:w="680"/>
+          </w:tcPr>
+          <w:p>
+            <w:pPr>
+              <w:bidi/>
+              <w:spacing w:after="40"/>
+              <w:jc w:val="right"/>
+            </w:pPr>
+            <w:r>
+              <w:rPr>
+                <w:rFonts w:ascii="Tahoma" w:hAnsi="Tahoma" w:cs="Tahoma" w:eastAsia="Tahoma"/>
+                <w:b w:val="0"/>
+                <w:sz w:val="20"/>
+                <w:rtl/>
+              </w:rPr>
+              <w:t>35</w:t>
+            </w:r>
+          </w:p>
+        </w:tc>
+        <w:tc>
+          <w:tcPr>
+            <w:tcW w:type="dxa" w:w="3969"/>
+          </w:tcPr>
+          <w:p>
+            <w:pPr>
+              <w:bidi/>
+              <w:spacing w:after="40"/>
+              <w:jc w:val="right"/>
+            </w:pPr>
+            <w:r>
+              <w:rPr>
+                <w:rFonts w:ascii="Tahoma" w:hAnsi="Tahoma" w:cs="Tahoma" w:eastAsia="Tahoma"/>
+                <w:b w:val="0"/>
+                <w:sz w:val="20"/>
+                <w:rtl/>
+              </w:rPr>
+              <w:t>الميزانية</w:t>
+            </w:r>
+          </w:p>
+        </w:tc>
+      </w:tr>
+      <w:tr>
+        <w:tc>
+          <w:tcPr>
+            <w:tcW w:type="dxa" w:w="680"/>
+          </w:tcPr>
+          <w:p>
+            <w:pPr>
+              <w:bidi/>
+              <w:spacing w:after="40"/>
+              <w:jc w:val="right"/>
+            </w:pPr>
+            <w:r>
+              <w:rPr>
+                <w:rFonts w:ascii="Tahoma" w:hAnsi="Tahoma" w:cs="Tahoma" w:eastAsia="Tahoma"/>
+                <w:b w:val="0"/>
+                <w:sz w:val="20"/>
+                <w:rtl/>
+              </w:rPr>
+              <w:t>18</w:t>
+            </w:r>
+          </w:p>
+        </w:tc>
+        <w:tc>
+          <w:tcPr>
+            <w:tcW w:type="dxa" w:w="3969"/>
+          </w:tcPr>
+          <w:p>
+            <w:pPr>
+              <w:bidi/>
+              <w:spacing w:after="40"/>
+              <w:jc w:val="right"/>
+            </w:pPr>
+            <w:r>
+              <w:rPr>
+                <w:rFonts w:ascii="Tahoma" w:hAnsi="Tahoma" w:cs="Tahoma" w:eastAsia="Tahoma"/>
+                <w:b w:val="0"/>
+                <w:sz w:val="20"/>
+                <w:rtl/>
+              </w:rPr>
               <w:t>المقارنات المالية</w:t>
             </w:r>
           </w:p>
@@ -4934,7 +5486,6 @@
                 <w:sz w:val="20"/>
                 <w:rtl/>
               </w:rPr>
-              <w:t>28</w:t>
             </w:r>
           </w:p>
         </w:tc>
@@ -4955,7 +5506,6 @@
                 <w:sz w:val="20"/>
                 <w:rtl/>
               </w:rPr>
-              <w:t>المعاينة والتصدير</w:t>
             </w:r>
           </w:p>
         </w:tc>
@@ -5934,7 +6484,7 @@
           <w:sz w:val="22"/>
           <w:rtl/>
         </w:rPr>
-        <w:t>شملت جلسات التطوير الأخيرة (من v3.1.3 إلى v3.1.7) إضافة مجموعة من الميزات المتقدمة التي تُعدّ جوهر الابتكار في هذا المشروع:</w:t>
+        <w:t>شملت جلسات التطوير الأخيرة (من v3.1.3 إلى v3.1.8) إضافة مجموعة من الميزات المتقدمة التي تُعدّ جوهر الابتكار في هذا المشروع:</w:t>
       </w:r>
     </w:p>
     <w:p>
@@ -7112,7 +7662,7 @@
           <w:sz w:val="22"/>
           <w:rtl/>
         </w:rPr>
-        <w:t>1800 اختباراً ناجحاً + تغطية وحدات 100%</w:t>
+        <w:t>2020 اختباراً ناجحاً + تغطية وحدات 100%</w:t>
       </w:r>
     </w:p>
     <w:p>
@@ -7511,6 +8061,826 @@
       <w:pPr>
         <w:keepNext/>
         <w:bidi/>
+        <w:spacing w:before="200" w:after="120"/>
+        <w:jc w:val="right"/>
+      </w:pPr>
+      <w:r>
+        <w:rPr>
+          <w:rFonts w:ascii="Tahoma" w:hAnsi="Tahoma" w:cs="Tahoma" w:eastAsia="Tahoma"/>
+          <w:b/>
+          <w:color w:val="1E3A5F"/>
+          <w:sz w:val="26"/>
+          <w:rtl/>
+        </w:rPr>
+        <w:t>13.16 الشاشات المحاسبية الجديدة (شاشات 30–35)</w:t>
+      </w:r>
+    </w:p>
+    <w:p>
+      <w:pPr>
+        <w:bidi/>
+        <w:spacing w:after="120" w:before="0" w:line="276" w:lineRule="auto"/>
+        <w:jc w:val="right"/>
+      </w:pPr>
+      <w:r>
+        <w:rPr>
+          <w:rFonts w:ascii="Tahoma" w:hAnsi="Tahoma" w:cs="Tahoma" w:eastAsia="Tahoma"/>
+          <w:b w:val="0"/>
+          <w:sz w:val="22"/>
+          <w:rtl/>
+        </w:rPr>
+        <w:t>أُضيفت 6 شاشات محاسبية في الإصدار v3.1.8 تُكمل الدورة المحاسبية الأساسية:</w:t>
+      </w:r>
+    </w:p>
+    <w:p>
+      <w:pPr>
+        <w:bidi/>
+        <w:spacing w:after="60"/>
+        <w:ind w:left="454"/>
+        <w:jc w:val="right"/>
+      </w:pPr>
+      <w:r>
+        <w:rPr>
+          <w:rFonts w:ascii="Tahoma" w:hAnsi="Tahoma" w:cs="Tahoma" w:eastAsia="Tahoma"/>
+          <w:b/>
+          <w:sz w:val="22"/>
+          <w:rtl/>
+        </w:rPr>
+        <w:t xml:space="preserve">• </w:t>
+      </w:r>
+      <w:r>
+        <w:rPr>
+          <w:rFonts w:ascii="Tahoma" w:hAnsi="Tahoma" w:cs="Tahoma" w:eastAsia="Tahoma"/>
+          <w:b w:val="0"/>
+          <w:sz w:val="22"/>
+          <w:rtl/>
+        </w:rPr>
+        <w:t>ميزان المراجعة (30): أرصدة الحسابات مدينة/دائنة مع تسوية وأستاذ عام</w:t>
+      </w:r>
+    </w:p>
+    <w:p>
+      <w:pPr>
+        <w:bidi/>
+        <w:spacing w:after="60"/>
+        <w:ind w:left="454"/>
+        <w:jc w:val="right"/>
+      </w:pPr>
+      <w:r>
+        <w:rPr>
+          <w:rFonts w:ascii="Tahoma" w:hAnsi="Tahoma" w:cs="Tahoma" w:eastAsia="Tahoma"/>
+          <w:b/>
+          <w:sz w:val="22"/>
+          <w:rtl/>
+        </w:rPr>
+        <w:t xml:space="preserve">• </w:t>
+      </w:r>
+      <w:r>
+        <w:rPr>
+          <w:rFonts w:ascii="Tahoma" w:hAnsi="Tahoma" w:cs="Tahoma" w:eastAsia="Tahoma"/>
+          <w:b w:val="0"/>
+          <w:sz w:val="22"/>
+          <w:rtl/>
+        </w:rPr>
+        <w:t>الشركاء والعملاء (31): تقادم ديون العملاء والموردين وتحليل الملاءة</w:t>
+      </w:r>
+    </w:p>
+    <w:p>
+      <w:pPr>
+        <w:bidi/>
+        <w:spacing w:after="60"/>
+        <w:ind w:left="454"/>
+        <w:jc w:val="right"/>
+      </w:pPr>
+      <w:r>
+        <w:rPr>
+          <w:rFonts w:ascii="Tahoma" w:hAnsi="Tahoma" w:cs="Tahoma" w:eastAsia="Tahoma"/>
+          <w:b/>
+          <w:sz w:val="22"/>
+          <w:rtl/>
+        </w:rPr>
+        <w:t xml:space="preserve">• </w:t>
+      </w:r>
+      <w:r>
+        <w:rPr>
+          <w:rFonts w:ascii="Tahoma" w:hAnsi="Tahoma" w:cs="Tahoma" w:eastAsia="Tahoma"/>
+          <w:b w:val="0"/>
+          <w:sz w:val="22"/>
+          <w:rtl/>
+        </w:rPr>
+        <w:t>الفواتير (32): إدارة الفواتير مع حساب TVA وتقارير دورية</w:t>
+      </w:r>
+    </w:p>
+    <w:p>
+      <w:pPr>
+        <w:bidi/>
+        <w:spacing w:after="60"/>
+        <w:ind w:left="454"/>
+        <w:jc w:val="right"/>
+      </w:pPr>
+      <w:r>
+        <w:rPr>
+          <w:rFonts w:ascii="Tahoma" w:hAnsi="Tahoma" w:cs="Tahoma" w:eastAsia="Tahoma"/>
+          <w:b/>
+          <w:sz w:val="22"/>
+          <w:rtl/>
+        </w:rPr>
+        <w:t xml:space="preserve">• </w:t>
+      </w:r>
+      <w:r>
+        <w:rPr>
+          <w:rFonts w:ascii="Tahoma" w:hAnsi="Tahoma" w:cs="Tahoma" w:eastAsia="Tahoma"/>
+          <w:b w:val="0"/>
+          <w:sz w:val="22"/>
+          <w:rtl/>
+        </w:rPr>
+        <w:t>المخزون (33): جرد وتقييم المخزون بمتوسط التكلفة المتحرك</w:t>
+      </w:r>
+    </w:p>
+    <w:p>
+      <w:pPr>
+        <w:bidi/>
+        <w:spacing w:after="60"/>
+        <w:ind w:left="454"/>
+        <w:jc w:val="right"/>
+      </w:pPr>
+      <w:r>
+        <w:rPr>
+          <w:rFonts w:ascii="Tahoma" w:hAnsi="Tahoma" w:cs="Tahoma" w:eastAsia="Tahoma"/>
+          <w:b/>
+          <w:sz w:val="22"/>
+          <w:rtl/>
+        </w:rPr>
+        <w:t xml:space="preserve">• </w:t>
+      </w:r>
+      <w:r>
+        <w:rPr>
+          <w:rFonts w:ascii="Tahoma" w:hAnsi="Tahoma" w:cs="Tahoma" w:eastAsia="Tahoma"/>
+          <w:b w:val="0"/>
+          <w:sz w:val="22"/>
+          <w:rtl/>
+        </w:rPr>
+        <w:t>الرواتب والأجور (34): كشف الرواتب مع خصم CNAS وIRG وكشف سنوي</w:t>
+      </w:r>
+    </w:p>
+    <w:p>
+      <w:pPr>
+        <w:bidi/>
+        <w:spacing w:after="60"/>
+        <w:ind w:left="454"/>
+        <w:jc w:val="right"/>
+      </w:pPr>
+      <w:r>
+        <w:rPr>
+          <w:rFonts w:ascii="Tahoma" w:hAnsi="Tahoma" w:cs="Tahoma" w:eastAsia="Tahoma"/>
+          <w:b/>
+          <w:sz w:val="22"/>
+          <w:rtl/>
+        </w:rPr>
+        <w:t xml:space="preserve">• </w:t>
+      </w:r>
+      <w:r>
+        <w:rPr>
+          <w:rFonts w:ascii="Tahoma" w:hAnsi="Tahoma" w:cs="Tahoma" w:eastAsia="Tahoma"/>
+          <w:b w:val="0"/>
+          <w:sz w:val="22"/>
+          <w:rtl/>
+        </w:rPr>
+        <w:t>الميزانية (35): مقارنة فعلية/مخططة وانحرافات وتوقعات</w:t>
+      </w:r>
+    </w:p>
+    <w:p>
+      <w:pPr>
+        <w:keepNext/>
+        <w:bidi/>
+        <w:spacing w:before="200" w:after="120"/>
+        <w:jc w:val="right"/>
+      </w:pPr>
+      <w:r>
+        <w:rPr>
+          <w:rFonts w:ascii="Tahoma" w:hAnsi="Tahoma" w:cs="Tahoma" w:eastAsia="Tahoma"/>
+          <w:b/>
+          <w:color w:val="1E3A5F"/>
+          <w:sz w:val="26"/>
+          <w:rtl/>
+        </w:rPr>
+        <w:t>13.17 نظام السنوات الجبائية (2025/2026)</w:t>
+      </w:r>
+    </w:p>
+    <w:p>
+      <w:pPr>
+        <w:bidi/>
+        <w:spacing w:after="120" w:before="0" w:line="276" w:lineRule="auto"/>
+        <w:jc w:val="right"/>
+      </w:pPr>
+      <w:r>
+        <w:rPr>
+          <w:rFonts w:ascii="Tahoma" w:hAnsi="Tahoma" w:cs="Tahoma" w:eastAsia="Tahoma"/>
+          <w:b w:val="0"/>
+          <w:sz w:val="22"/>
+          <w:rtl/>
+        </w:rPr>
+        <w:t>أُضيف نظام إدارة السنوات الجبائية لتمكين المحاسب من العمل على الإعدادات الضريبية للسنة المختارة، استناداً إلى نشرة DGI الرسمية لسنة 2026:</w:t>
+      </w:r>
+    </w:p>
+    <w:p>
+      <w:pPr>
+        <w:bidi/>
+        <w:spacing w:after="60"/>
+        <w:ind w:left="454"/>
+        <w:jc w:val="right"/>
+      </w:pPr>
+      <w:r>
+        <w:rPr>
+          <w:rFonts w:ascii="Tahoma" w:hAnsi="Tahoma" w:cs="Tahoma" w:eastAsia="Tahoma"/>
+          <w:b/>
+          <w:sz w:val="22"/>
+          <w:rtl/>
+        </w:rPr>
+        <w:t xml:space="preserve">• </w:t>
+      </w:r>
+      <w:r>
+        <w:rPr>
+          <w:rFonts w:ascii="Tahoma" w:hAnsi="Tahoma" w:cs="Tahoma" w:eastAsia="Tahoma"/>
+          <w:b w:val="0"/>
+          <w:sz w:val="22"/>
+          <w:rtl/>
+        </w:rPr>
+        <w:t>ملفا tax_config_2025.json (مرجعي) وtax_config_2026.json (وفق النشرة الجديدة)</w:t>
+      </w:r>
+    </w:p>
+    <w:p>
+      <w:pPr>
+        <w:bidi/>
+        <w:spacing w:after="60"/>
+        <w:ind w:left="454"/>
+        <w:jc w:val="right"/>
+      </w:pPr>
+      <w:r>
+        <w:rPr>
+          <w:rFonts w:ascii="Tahoma" w:hAnsi="Tahoma" w:cs="Tahoma" w:eastAsia="Tahoma"/>
+          <w:b/>
+          <w:sz w:val="22"/>
+          <w:rtl/>
+        </w:rPr>
+        <w:t xml:space="preserve">• </w:t>
+      </w:r>
+      <w:r>
+        <w:rPr>
+          <w:rFonts w:ascii="Tahoma" w:hAnsi="Tahoma" w:cs="Tahoma" w:eastAsia="Tahoma"/>
+          <w:b w:val="0"/>
+          <w:sz w:val="22"/>
+          <w:rtl/>
+        </w:rPr>
+        <w:t>شرائح IRG 2026 محدّثة: 0% / 23% / 27% / 30% / 33% / 35%</w:t>
+      </w:r>
+    </w:p>
+    <w:p>
+      <w:pPr>
+        <w:bidi/>
+        <w:spacing w:after="60"/>
+        <w:ind w:left="454"/>
+        <w:jc w:val="right"/>
+      </w:pPr>
+      <w:r>
+        <w:rPr>
+          <w:rFonts w:ascii="Tahoma" w:hAnsi="Tahoma" w:cs="Tahoma" w:eastAsia="Tahoma"/>
+          <w:b/>
+          <w:sz w:val="22"/>
+          <w:rtl/>
+        </w:rPr>
+        <w:t xml:space="preserve">• </w:t>
+      </w:r>
+      <w:r>
+        <w:rPr>
+          <w:rFonts w:ascii="Tahoma" w:hAnsi="Tahoma" w:cs="Tahoma" w:eastAsia="Tahoma"/>
+          <w:b w:val="0"/>
+          <w:sz w:val="22"/>
+          <w:rtl/>
+        </w:rPr>
+        <w:t>إضافة IFU (0.5% / 5% / 12% بحد أدنى 30,000 دج)</w:t>
+      </w:r>
+    </w:p>
+    <w:p>
+      <w:pPr>
+        <w:bidi/>
+        <w:spacing w:after="60"/>
+        <w:ind w:left="454"/>
+        <w:jc w:val="right"/>
+      </w:pPr>
+      <w:r>
+        <w:rPr>
+          <w:rFonts w:ascii="Tahoma" w:hAnsi="Tahoma" w:cs="Tahoma" w:eastAsia="Tahoma"/>
+          <w:b/>
+          <w:sz w:val="22"/>
+          <w:rtl/>
+        </w:rPr>
+        <w:t xml:space="preserve">• </w:t>
+      </w:r>
+      <w:r>
+        <w:rPr>
+          <w:rFonts w:ascii="Tahoma" w:hAnsi="Tahoma" w:cs="Tahoma" w:eastAsia="Tahoma"/>
+          <w:b w:val="0"/>
+          <w:sz w:val="22"/>
+          <w:rtl/>
+        </w:rPr>
+        <w:t>رسم التكوين والتمهين (1%+1% خصم بالإنفاق)</w:t>
+      </w:r>
+    </w:p>
+    <w:p>
+      <w:pPr>
+        <w:bidi/>
+        <w:spacing w:after="60"/>
+        <w:ind w:left="454"/>
+        <w:jc w:val="right"/>
+      </w:pPr>
+      <w:r>
+        <w:rPr>
+          <w:rFonts w:ascii="Tahoma" w:hAnsi="Tahoma" w:cs="Tahoma" w:eastAsia="Tahoma"/>
+          <w:b/>
+          <w:sz w:val="22"/>
+          <w:rtl/>
+        </w:rPr>
+        <w:t xml:space="preserve">• </w:t>
+      </w:r>
+      <w:r>
+        <w:rPr>
+          <w:rFonts w:ascii="Tahoma" w:hAnsi="Tahoma" w:cs="Tahoma" w:eastAsia="Tahoma"/>
+          <w:b w:val="0"/>
+          <w:sz w:val="22"/>
+          <w:rtl/>
+        </w:rPr>
+        <w:t>اقتطاع الإيجارات (7%/15%/مؤقت 7% فوق 1.8M)</w:t>
+      </w:r>
+    </w:p>
+    <w:p>
+      <w:pPr>
+        <w:bidi/>
+        <w:spacing w:after="60"/>
+        <w:ind w:left="454"/>
+        <w:jc w:val="right"/>
+      </w:pPr>
+      <w:r>
+        <w:rPr>
+          <w:rFonts w:ascii="Tahoma" w:hAnsi="Tahoma" w:cs="Tahoma" w:eastAsia="Tahoma"/>
+          <w:b/>
+          <w:sz w:val="22"/>
+          <w:rtl/>
+        </w:rPr>
+        <w:t xml:space="preserve">• </w:t>
+      </w:r>
+      <w:r>
+        <w:rPr>
+          <w:rFonts w:ascii="Tahoma" w:hAnsi="Tahoma" w:cs="Tahoma" w:eastAsia="Tahoma"/>
+          <w:b w:val="0"/>
+          <w:sz w:val="22"/>
+          <w:rtl/>
+        </w:rPr>
+        <w:t>تبويب «سنوات النظام» في TaxView: مبدّل سنوات + محرر JSON + حاسبات</w:t>
+      </w:r>
+    </w:p>
+    <w:p>
+      <w:pPr>
+        <w:keepNext/>
+        <w:bidi/>
+        <w:spacing w:before="200" w:after="120"/>
+        <w:jc w:val="right"/>
+      </w:pPr>
+      <w:r>
+        <w:rPr>
+          <w:rFonts w:ascii="Tahoma" w:hAnsi="Tahoma" w:cs="Tahoma" w:eastAsia="Tahoma"/>
+          <w:b/>
+          <w:color w:val="1E3A5F"/>
+          <w:sz w:val="26"/>
+          <w:rtl/>
+        </w:rPr>
+        <w:t>13.18 الوحدات التجارية (Licensing + Encryption + Entitlement)</w:t>
+      </w:r>
+    </w:p>
+    <w:p>
+      <w:pPr>
+        <w:bidi/>
+        <w:spacing w:after="120" w:before="0" w:line="276" w:lineRule="auto"/>
+        <w:jc w:val="right"/>
+      </w:pPr>
+      <w:r>
+        <w:rPr>
+          <w:rFonts w:ascii="Tahoma" w:hAnsi="Tahoma" w:cs="Tahoma" w:eastAsia="Tahoma"/>
+          <w:b w:val="0"/>
+          <w:sz w:val="22"/>
+          <w:rtl/>
+        </w:rPr>
+        <w:t>أُضيفت ثلاث وحدات تجارية في إطار حماية المنتج وتأمينه:</w:t>
+      </w:r>
+    </w:p>
+    <w:p>
+      <w:pPr>
+        <w:bidi/>
+        <w:spacing w:after="60"/>
+        <w:ind w:left="454"/>
+        <w:jc w:val="right"/>
+      </w:pPr>
+      <w:r>
+        <w:rPr>
+          <w:rFonts w:ascii="Tahoma" w:hAnsi="Tahoma" w:cs="Tahoma" w:eastAsia="Tahoma"/>
+          <w:b/>
+          <w:sz w:val="22"/>
+          <w:rtl/>
+        </w:rPr>
+        <w:t xml:space="preserve">• </w:t>
+      </w:r>
+      <w:r>
+        <w:rPr>
+          <w:rFonts w:ascii="Tahoma" w:hAnsi="Tahoma" w:cs="Tahoma" w:eastAsia="Tahoma"/>
+          <w:b w:val="0"/>
+          <w:sz w:val="22"/>
+          <w:rtl/>
+        </w:rPr>
+        <w:t>Module 1 – الترخيص (commercial/licensing/): مفاتيح RSA-2048 بتوقيع PKCS1v15 SHA-256 + تثبيت على عتاد المستخدم (MAC+CPU+Disk → SHA-256) + مهلة 14 يوماً ثم read-only + طبقات FREE/PRO/ENTERPRISE</w:t>
+      </w:r>
+    </w:p>
+    <w:p>
+      <w:pPr>
+        <w:bidi/>
+        <w:spacing w:after="60"/>
+        <w:ind w:left="454"/>
+        <w:jc w:val="right"/>
+      </w:pPr>
+      <w:r>
+        <w:rPr>
+          <w:rFonts w:ascii="Tahoma" w:hAnsi="Tahoma" w:cs="Tahoma" w:eastAsia="Tahoma"/>
+          <w:b/>
+          <w:sz w:val="22"/>
+          <w:rtl/>
+        </w:rPr>
+        <w:t xml:space="preserve">• </w:t>
+      </w:r>
+      <w:r>
+        <w:rPr>
+          <w:rFonts w:ascii="Tahoma" w:hAnsi="Tahoma" w:cs="Tahoma" w:eastAsia="Tahoma"/>
+          <w:b w:val="0"/>
+          <w:sz w:val="22"/>
+          <w:rtl/>
+        </w:rPr>
+        <w:t>Module 2 – التشفير (commercial/encryption/): Argon2id من cryptography المدمج + تنسيق SACF1 (AES-256-GCM: الـ tag يصادق الرأس كاملاً) + دعم توافق القديم PBKDF2</w:t>
+      </w:r>
+    </w:p>
+    <w:p>
+      <w:pPr>
+        <w:bidi/>
+        <w:spacing w:after="60"/>
+        <w:ind w:left="454"/>
+        <w:jc w:val="right"/>
+      </w:pPr>
+      <w:r>
+        <w:rPr>
+          <w:rFonts w:ascii="Tahoma" w:hAnsi="Tahoma" w:cs="Tahoma" w:eastAsia="Tahoma"/>
+          <w:b/>
+          <w:sz w:val="22"/>
+          <w:rtl/>
+        </w:rPr>
+        <w:t xml:space="preserve">• </w:t>
+      </w:r>
+      <w:r>
+        <w:rPr>
+          <w:rFonts w:ascii="Tahoma" w:hAnsi="Tahoma" w:cs="Tahoma" w:eastAsia="Tahoma"/>
+          <w:b w:val="0"/>
+          <w:sz w:val="22"/>
+          <w:rtl/>
+        </w:rPr>
+        <w:t>Module 3 – البوابات (commercial/entitlement.py): current_tier()/feature_allowed()/set_store() — بوابات مفعّلة: cloud_sync على PRO، ai_unlimited على ENTERPRISE</w:t>
+      </w:r>
+    </w:p>
+    <w:p>
+      <w:pPr>
+        <w:keepNext/>
+        <w:bidi/>
+        <w:spacing w:before="200" w:after="120"/>
+        <w:jc w:val="right"/>
+      </w:pPr>
+      <w:r>
+        <w:rPr>
+          <w:rFonts w:ascii="Tahoma" w:hAnsi="Tahoma" w:cs="Tahoma" w:eastAsia="Tahoma"/>
+          <w:b/>
+          <w:color w:val="1E3A5F"/>
+          <w:sz w:val="26"/>
+          <w:rtl/>
+        </w:rPr>
+        <w:t>13.19 حفظ الجلسة المشفّر (Remember Me)</w:t>
+      </w:r>
+    </w:p>
+    <w:p>
+      <w:pPr>
+        <w:bidi/>
+        <w:spacing w:after="120" w:before="0" w:line="276" w:lineRule="auto"/>
+        <w:jc w:val="right"/>
+      </w:pPr>
+      <w:r>
+        <w:rPr>
+          <w:rFonts w:ascii="Tahoma" w:hAnsi="Tahoma" w:cs="Tahoma" w:eastAsia="Tahoma"/>
+          <w:b w:val="0"/>
+          <w:sz w:val="22"/>
+          <w:rtl/>
+        </w:rPr>
+        <w:t>ميزة «تذكرني» في شاشة الدخول تحفظ الجلسة بتشفير AES-256-GCM بمفتاح SHA-256 لبصمة العتاد (hardware_id.fingerprint):</w:t>
+      </w:r>
+    </w:p>
+    <w:p>
+      <w:pPr>
+        <w:bidi/>
+        <w:spacing w:after="60"/>
+        <w:ind w:left="454"/>
+        <w:jc w:val="right"/>
+      </w:pPr>
+      <w:r>
+        <w:rPr>
+          <w:rFonts w:ascii="Tahoma" w:hAnsi="Tahoma" w:cs="Tahoma" w:eastAsia="Tahoma"/>
+          <w:b/>
+          <w:sz w:val="22"/>
+          <w:rtl/>
+        </w:rPr>
+        <w:t xml:space="preserve">• </w:t>
+      </w:r>
+      <w:r>
+        <w:rPr>
+          <w:rFonts w:ascii="Tahoma" w:hAnsi="Tahoma" w:cs="Tahoma" w:eastAsia="Tahoma"/>
+          <w:b w:val="0"/>
+          <w:sz w:val="22"/>
+          <w:rtl/>
+        </w:rPr>
+        <w:t>كلمة السر لا تُكتب نصاً أبداً — تعمل على جهاز التخزين فقط</w:t>
+      </w:r>
+    </w:p>
+    <w:p>
+      <w:pPr>
+        <w:bidi/>
+        <w:spacing w:after="60"/>
+        <w:ind w:left="454"/>
+        <w:jc w:val="right"/>
+      </w:pPr>
+      <w:r>
+        <w:rPr>
+          <w:rFonts w:ascii="Tahoma" w:hAnsi="Tahoma" w:cs="Tahoma" w:eastAsia="Tahoma"/>
+          <w:b/>
+          <w:sz w:val="22"/>
+          <w:rtl/>
+        </w:rPr>
+        <w:t xml:space="preserve">• </w:t>
+      </w:r>
+      <w:r>
+        <w:rPr>
+          <w:rFonts w:ascii="Tahoma" w:hAnsi="Tahoma" w:cs="Tahoma" w:eastAsia="Tahoma"/>
+          <w:b w:val="0"/>
+          <w:sz w:val="22"/>
+          <w:rtl/>
+        </w:rPr>
+        <w:t>الجهاز الآخر: إكمال تلقائي للبريد وفشل آمن</w:t>
+      </w:r>
+    </w:p>
+    <w:p>
+      <w:pPr>
+        <w:bidi/>
+        <w:spacing w:after="60"/>
+        <w:ind w:left="454"/>
+        <w:jc w:val="right"/>
+      </w:pPr>
+      <w:r>
+        <w:rPr>
+          <w:rFonts w:ascii="Tahoma" w:hAnsi="Tahoma" w:cs="Tahoma" w:eastAsia="Tahoma"/>
+          <w:b/>
+          <w:sz w:val="22"/>
+          <w:rtl/>
+        </w:rPr>
+        <w:t xml:space="preserve">• </w:t>
+      </w:r>
+      <w:r>
+        <w:rPr>
+          <w:rFonts w:ascii="Tahoma" w:hAnsi="Tahoma" w:cs="Tahoma" w:eastAsia="Tahoma"/>
+          <w:b w:val="0"/>
+          <w:sz w:val="22"/>
+          <w:rtl/>
+        </w:rPr>
+        <w:t>حراسة تلقائية: لا تسجيل تلقائي عند must_change_password/2FA/كلمة خاطئة</w:t>
+      </w:r>
+    </w:p>
+    <w:p>
+      <w:pPr>
+        <w:bidi/>
+        <w:spacing w:after="60"/>
+        <w:ind w:left="454"/>
+        <w:jc w:val="right"/>
+      </w:pPr>
+      <w:r>
+        <w:rPr>
+          <w:rFonts w:ascii="Tahoma" w:hAnsi="Tahoma" w:cs="Tahoma" w:eastAsia="Tahoma"/>
+          <w:b/>
+          <w:sz w:val="22"/>
+          <w:rtl/>
+        </w:rPr>
+        <w:t xml:space="preserve">• </w:t>
+      </w:r>
+      <w:r>
+        <w:rPr>
+          <w:rFonts w:ascii="Tahoma" w:hAnsi="Tahoma" w:cs="Tahoma" w:eastAsia="Tahoma"/>
+          <w:b w:val="0"/>
+          <w:sz w:val="22"/>
+          <w:rtl/>
+        </w:rPr>
+        <w:t>تسجيل الخروج يمسح كلمة السر المخزّنة فقط (يبقي البريد)</w:t>
+      </w:r>
+    </w:p>
+    <w:p>
+      <w:pPr>
+        <w:keepNext/>
+        <w:bidi/>
+        <w:spacing w:before="200" w:after="120"/>
+        <w:jc w:val="right"/>
+      </w:pPr>
+      <w:r>
+        <w:rPr>
+          <w:rFonts w:ascii="Tahoma" w:hAnsi="Tahoma" w:cs="Tahoma" w:eastAsia="Tahoma"/>
+          <w:b/>
+          <w:color w:val="1E3A5F"/>
+          <w:sz w:val="26"/>
+          <w:rtl/>
+        </w:rPr>
+        <w:t>13.20 تنظيم وتوحيد الواجهة (v3.1.8)</w:t>
+      </w:r>
+    </w:p>
+    <w:p>
+      <w:pPr>
+        <w:bidi/>
+        <w:spacing w:after="120" w:before="0" w:line="276" w:lineRule="auto"/>
+        <w:jc w:val="right"/>
+      </w:pPr>
+      <w:r>
+        <w:rPr>
+          <w:rFonts w:ascii="Tahoma" w:hAnsi="Tahoma" w:cs="Tahoma" w:eastAsia="Tahoma"/>
+          <w:b w:val="0"/>
+          <w:sz w:val="22"/>
+          <w:rtl/>
+        </w:rPr>
+        <w:t>شملت جلسات v3.1.8 تنظيم الواجهة بشكل شامل لمعالجة ملاحظات المستخدمين:</w:t>
+      </w:r>
+    </w:p>
+    <w:p>
+      <w:pPr>
+        <w:bidi/>
+        <w:spacing w:after="60"/>
+        <w:ind w:left="454"/>
+        <w:jc w:val="right"/>
+      </w:pPr>
+      <w:r>
+        <w:rPr>
+          <w:rFonts w:ascii="Tahoma" w:hAnsi="Tahoma" w:cs="Tahoma" w:eastAsia="Tahoma"/>
+          <w:b/>
+          <w:sz w:val="22"/>
+          <w:rtl/>
+        </w:rPr>
+        <w:t xml:space="preserve">• </w:t>
+      </w:r>
+      <w:r>
+        <w:rPr>
+          <w:rFonts w:ascii="Tahoma" w:hAnsi="Tahoma" w:cs="Tahoma" w:eastAsia="Tahoma"/>
+          <w:b w:val="0"/>
+          <w:sz w:val="22"/>
+          <w:rtl/>
+        </w:rPr>
+        <w:t>الشريط الجانبي المجمّع: 6 مجموعات (رئيسي/محاسبة/تحليل/جباية/أدوات/نظام) بعناوين غير قابلة للنقر</w:t>
+      </w:r>
+    </w:p>
+    <w:p>
+      <w:pPr>
+        <w:bidi/>
+        <w:spacing w:after="60"/>
+        <w:ind w:left="454"/>
+        <w:jc w:val="right"/>
+      </w:pPr>
+      <w:r>
+        <w:rPr>
+          <w:rFonts w:ascii="Tahoma" w:hAnsi="Tahoma" w:cs="Tahoma" w:eastAsia="Tahoma"/>
+          <w:b/>
+          <w:sz w:val="22"/>
+          <w:rtl/>
+        </w:rPr>
+        <w:t xml:space="preserve">• </w:t>
+      </w:r>
+      <w:r>
+        <w:rPr>
+          <w:rFonts w:ascii="Tahoma" w:hAnsi="Tahoma" w:cs="Tahoma" w:eastAsia="Tahoma"/>
+          <w:b w:val="0"/>
+          <w:sz w:val="22"/>
+          <w:rtl/>
+        </w:rPr>
+        <w:t>نافذة متكيفة: حجم النافذة يتكيف مع دقة الشاشة تلقائياً عبر availableGeometry()</w:t>
+      </w:r>
+    </w:p>
+    <w:p>
+      <w:pPr>
+        <w:bidi/>
+        <w:spacing w:after="60"/>
+        <w:ind w:left="454"/>
+        <w:jc w:val="right"/>
+      </w:pPr>
+      <w:r>
+        <w:rPr>
+          <w:rFonts w:ascii="Tahoma" w:hAnsi="Tahoma" w:cs="Tahoma" w:eastAsia="Tahoma"/>
+          <w:b/>
+          <w:sz w:val="22"/>
+          <w:rtl/>
+        </w:rPr>
+        <w:t xml:space="preserve">• </w:t>
+      </w:r>
+      <w:r>
+        <w:rPr>
+          <w:rFonts w:ascii="Tahoma" w:hAnsi="Tahoma" w:cs="Tahoma" w:eastAsia="Tahoma"/>
+          <w:b w:val="0"/>
+          <w:sz w:val="22"/>
+          <w:rtl/>
+        </w:rPr>
+        <w:t>شريط حالة 40px مع ملصق إصدار دائم v3.1.8</w:t>
+      </w:r>
+    </w:p>
+    <w:p>
+      <w:pPr>
+        <w:bidi/>
+        <w:spacing w:after="60"/>
+        <w:ind w:left="454"/>
+        <w:jc w:val="right"/>
+      </w:pPr>
+      <w:r>
+        <w:rPr>
+          <w:rFonts w:ascii="Tahoma" w:hAnsi="Tahoma" w:cs="Tahoma" w:eastAsia="Tahoma"/>
+          <w:b/>
+          <w:sz w:val="22"/>
+          <w:rtl/>
+        </w:rPr>
+        <w:t xml:space="preserve">• </w:t>
+      </w:r>
+      <w:r>
+        <w:rPr>
+          <w:rFonts w:ascii="Tahoma" w:hAnsi="Tahoma" w:cs="Tahoma" w:eastAsia="Tahoma"/>
+          <w:b w:val="0"/>
+          <w:sz w:val="22"/>
+          <w:rtl/>
+        </w:rPr>
+        <w:t>توحيد ارتفاعات العناصر: حقول وأزرار 40px، صفوف جداول 44px عبر كل الشاشات الـ35</w:t>
+      </w:r>
+    </w:p>
+    <w:p>
+      <w:pPr>
+        <w:bidi/>
+        <w:spacing w:after="60"/>
+        <w:ind w:left="454"/>
+        <w:jc w:val="right"/>
+      </w:pPr>
+      <w:r>
+        <w:rPr>
+          <w:rFonts w:ascii="Tahoma" w:hAnsi="Tahoma" w:cs="Tahoma" w:eastAsia="Tahoma"/>
+          <w:b/>
+          <w:sz w:val="22"/>
+          <w:rtl/>
+        </w:rPr>
+        <w:t xml:space="preserve">• </w:t>
+      </w:r>
+      <w:r>
+        <w:rPr>
+          <w:rFonts w:ascii="Tahoma" w:hAnsi="Tahoma" w:cs="Tahoma" w:eastAsia="Tahoma"/>
+          <w:b w:val="0"/>
+          <w:sz w:val="22"/>
+          <w:rtl/>
+        </w:rPr>
+        <w:t>توحيد الهوامش والتباعد: CARD_MARGINS (16,12,16,12) للبطاقات + (15,20,15,15) للمجموعات</w:t>
+      </w:r>
+    </w:p>
+    <w:p>
+      <w:pPr>
+        <w:bidi/>
+        <w:spacing w:after="60"/>
+        <w:ind w:left="454"/>
+        <w:jc w:val="right"/>
+      </w:pPr>
+      <w:r>
+        <w:rPr>
+          <w:rFonts w:ascii="Tahoma" w:hAnsi="Tahoma" w:cs="Tahoma" w:eastAsia="Tahoma"/>
+          <w:b/>
+          <w:sz w:val="22"/>
+          <w:rtl/>
+        </w:rPr>
+        <w:t xml:space="preserve">• </w:t>
+      </w:r>
+      <w:r>
+        <w:rPr>
+          <w:rFonts w:ascii="Tahoma" w:hAnsi="Tahoma" w:cs="Tahoma" w:eastAsia="Tahoma"/>
+          <w:b w:val="0"/>
+          <w:sz w:val="22"/>
+          <w:rtl/>
+        </w:rPr>
+        <w:t>إصلاح ترميز اللغة العربية في settings_view وإصلاح تداخل الحقول في tax_view</w:t>
+      </w:r>
+    </w:p>
+    <w:p>
+      <w:pPr>
+        <w:keepNext/>
+        <w:bidi/>
         <w:spacing w:before="280" w:after="160"/>
         <w:jc w:val="right"/>
         <w:pBdr>
@@ -7541,7 +8911,7 @@
           <w:sz w:val="22"/>
           <w:rtl/>
         </w:rPr>
-        <w:t>تم تطوير 1229 اختبار وحدة موزعة على 45 ملف اختبار، تغطي جميع مكونات النظام، عبر `python -m pytest tests -q` (و1090 عبر unittest).</w:t>
+        <w:t>تم تطوير 2020 اختباراً موزعة على 65 ملف اختبار، تغطي جميع مكونات النظام، عبر `python -m pytest tests -q`.</w:t>
       </w:r>
     </w:p>
     <w:p>
@@ -7593,890 +8963,258 @@
           <w:sz w:val="26"/>
           <w:rtl/>
         </w:rPr>
-        <w:t>14.2 ملفات الاختبار الجديدة</w:t>
-      </w:r>
-    </w:p>
-    <w:tbl>
-      <w:tblPr>
-        <w:tblStyle w:val="TableGrid"/>
-        <w:tblW w:type="auto" w:w="0"/>
-        <w:tblLook w:firstColumn="1" w:firstRow="1" w:lastColumn="0" w:lastRow="0" w:noHBand="0" w:noVBand="1" w:val="04A0"/>
-      </w:tblPr>
-      <w:tblGrid>
-        <w:gridCol w:w="2493"/>
-        <w:gridCol w:w="2493"/>
-        <w:gridCol w:w="2493"/>
-        <w:gridCol w:w="2493"/>
-      </w:tblGrid>
-      <w:tr>
-        <w:tc>
-          <w:tcPr>
-            <w:tcW w:type="dxa" w:w="2948"/>
-            <w:shd w:val="clear" w:fill="1F7A33"/>
-          </w:tcPr>
-          <w:p>
-            <w:pPr>
-              <w:bidi/>
-              <w:spacing w:after="40"/>
-              <w:jc w:val="right"/>
-            </w:pPr>
-            <w:r>
-              <w:rPr>
-                <w:rFonts w:ascii="Tahoma" w:hAnsi="Tahoma" w:cs="Tahoma" w:eastAsia="Tahoma"/>
-                <w:b/>
-                <w:sz w:val="20"/>
-                <w:rtl/>
-              </w:rPr>
-              <w:t>ملف الاختبار</w:t>
-            </w:r>
-          </w:p>
-        </w:tc>
-        <w:tc>
-          <w:tcPr>
-            <w:tcW w:type="dxa" w:w="3402"/>
-            <w:shd w:val="clear" w:fill="1F7A33"/>
-          </w:tcPr>
-          <w:p>
-            <w:pPr>
-              <w:bidi/>
-              <w:spacing w:after="40"/>
-              <w:jc w:val="right"/>
-            </w:pPr>
-            <w:r>
-              <w:rPr>
-                <w:rFonts w:ascii="Tahoma" w:hAnsi="Tahoma" w:cs="Tahoma" w:eastAsia="Tahoma"/>
-                <w:b/>
-                <w:sz w:val="20"/>
-                <w:rtl/>
-              </w:rPr>
-              <w:t>الوحدات المغطاة</w:t>
-            </w:r>
-          </w:p>
-        </w:tc>
-        <w:tc>
-          <w:tcPr>
-            <w:tcW w:type="dxa" w:w="2948"/>
-            <w:shd w:val="clear" w:fill="1F7A33"/>
-          </w:tcPr>
-          <w:p>
-            <w:pPr>
-              <w:bidi/>
-              <w:spacing w:after="40"/>
-              <w:jc w:val="right"/>
-            </w:pPr>
-            <w:r>
-              <w:rPr>
-                <w:rFonts w:ascii="Tahoma" w:hAnsi="Tahoma" w:cs="Tahoma" w:eastAsia="Tahoma"/>
-                <w:b/>
-                <w:sz w:val="20"/>
-                <w:rtl/>
-              </w:rPr>
-              <w:t>ملف الاختبار</w:t>
-            </w:r>
-          </w:p>
-        </w:tc>
-        <w:tc>
-          <w:tcPr>
-            <w:tcW w:type="dxa" w:w="3402"/>
-            <w:shd w:val="clear" w:fill="1F7A33"/>
-          </w:tcPr>
-          <w:p>
-            <w:pPr>
-              <w:bidi/>
-              <w:spacing w:after="40"/>
-              <w:jc w:val="right"/>
-            </w:pPr>
-            <w:r>
-              <w:rPr>
-                <w:rFonts w:ascii="Tahoma" w:hAnsi="Tahoma" w:cs="Tahoma" w:eastAsia="Tahoma"/>
-                <w:b/>
-                <w:sz w:val="20"/>
-                <w:rtl/>
-              </w:rPr>
-              <w:t>الوحدات المغطاة</w:t>
-            </w:r>
-          </w:p>
-        </w:tc>
-      </w:tr>
-      <w:tr>
-        <w:tc>
-          <w:tcPr>
-            <w:tcW w:type="dxa" w:w="2948"/>
-          </w:tcPr>
-          <w:p>
-            <w:pPr>
-              <w:bidi/>
-              <w:spacing w:after="40"/>
-              <w:jc w:val="right"/>
-            </w:pPr>
-            <w:r>
-              <w:rPr>
-                <w:rFonts w:ascii="Tahoma" w:hAnsi="Tahoma" w:cs="Tahoma" w:eastAsia="Tahoma"/>
-                <w:b w:val="0"/>
-                <w:sz w:val="20"/>
-                <w:rtl/>
-              </w:rPr>
-              <w:t>test_edge_errors</w:t>
-            </w:r>
-          </w:p>
-        </w:tc>
-        <w:tc>
-          <w:tcPr>
-            <w:tcW w:type="dxa" w:w="3402"/>
-          </w:tcPr>
-          <w:p>
-            <w:pPr>
-              <w:bidi/>
-              <w:spacing w:after="40"/>
-              <w:jc w:val="right"/>
-            </w:pPr>
-            <w:r>
-              <w:rPr>
-                <w:rFonts w:ascii="Tahoma" w:hAnsi="Tahoma" w:cs="Tahoma" w:eastAsia="Tahoma"/>
-                <w:b w:val="0"/>
-                <w:sz w:val="20"/>
-                <w:rtl/>
-              </w:rPr>
-              <w:t>edge/error للميزات الست</w:t>
-            </w:r>
-          </w:p>
-        </w:tc>
-        <w:tc>
-          <w:tcPr>
-            <w:tcW w:type="dxa" w:w="2948"/>
-          </w:tcPr>
-          <w:p>
-            <w:pPr>
-              <w:bidi/>
-              <w:spacing w:after="40"/>
-              <w:jc w:val="right"/>
-            </w:pPr>
-            <w:r>
-              <w:rPr>
-                <w:rFonts w:ascii="Tahoma" w:hAnsi="Tahoma" w:cs="Tahoma" w:eastAsia="Tahoma"/>
-                <w:b w:val="0"/>
-                <w:sz w:val="20"/>
-                <w:rtl/>
-              </w:rPr>
-              <w:t>test_importers</w:t>
-            </w:r>
-          </w:p>
-        </w:tc>
-        <w:tc>
-          <w:tcPr>
-            <w:tcW w:type="dxa" w:w="3402"/>
-          </w:tcPr>
-          <w:p>
-            <w:pPr>
-              <w:bidi/>
-              <w:spacing w:after="40"/>
-              <w:jc w:val="right"/>
-            </w:pPr>
-            <w:r>
-              <w:rPr>
-                <w:rFonts w:ascii="Tahoma" w:hAnsi="Tahoma" w:cs="Tahoma" w:eastAsia="Tahoma"/>
-                <w:b w:val="0"/>
-                <w:sz w:val="20"/>
-                <w:rtl/>
-              </w:rPr>
-              <w:t>data_import + csv_import</w:t>
-            </w:r>
-          </w:p>
-        </w:tc>
-      </w:tr>
-      <w:tr>
-        <w:tc>
-          <w:tcPr>
-            <w:tcW w:type="dxa" w:w="2948"/>
-          </w:tcPr>
-          <w:p>
-            <w:pPr>
-              <w:bidi/>
-              <w:spacing w:after="40"/>
-              <w:jc w:val="right"/>
-            </w:pPr>
-            <w:r>
-              <w:rPr>
-                <w:rFonts w:ascii="Tahoma" w:hAnsi="Tahoma" w:cs="Tahoma" w:eastAsia="Tahoma"/>
-                <w:b w:val="0"/>
-                <w:sz w:val="20"/>
-                <w:rtl/>
-              </w:rPr>
-              <w:t>test_cashflow</w:t>
-            </w:r>
-          </w:p>
-        </w:tc>
-        <w:tc>
-          <w:tcPr>
-            <w:tcW w:type="dxa" w:w="3402"/>
-          </w:tcPr>
-          <w:p>
-            <w:pPr>
-              <w:bidi/>
-              <w:spacing w:after="40"/>
-              <w:jc w:val="right"/>
-            </w:pPr>
-            <w:r>
-              <w:rPr>
-                <w:rFonts w:ascii="Tahoma" w:hAnsi="Tahoma" w:cs="Tahoma" w:eastAsia="Tahoma"/>
-                <w:b w:val="0"/>
-                <w:sz w:val="20"/>
-                <w:rtl/>
-              </w:rPr>
-              <w:t>cashflow</w:t>
-            </w:r>
-          </w:p>
-        </w:tc>
-        <w:tc>
-          <w:tcPr>
-            <w:tcW w:type="dxa" w:w="2948"/>
-          </w:tcPr>
-          <w:p>
-            <w:pPr>
-              <w:bidi/>
-              <w:spacing w:after="40"/>
-              <w:jc w:val="right"/>
-            </w:pPr>
-            <w:r>
-              <w:rPr>
-                <w:rFonts w:ascii="Tahoma" w:hAnsi="Tahoma" w:cs="Tahoma" w:eastAsia="Tahoma"/>
-                <w:b w:val="0"/>
-                <w:sz w:val="20"/>
-                <w:rtl/>
-              </w:rPr>
-              <w:t>test_excel_export</w:t>
-            </w:r>
-          </w:p>
-        </w:tc>
-        <w:tc>
-          <w:tcPr>
-            <w:tcW w:type="dxa" w:w="3402"/>
-          </w:tcPr>
-          <w:p>
-            <w:pPr>
-              <w:bidi/>
-              <w:spacing w:after="40"/>
-              <w:jc w:val="right"/>
-            </w:pPr>
-            <w:r>
-              <w:rPr>
-                <w:rFonts w:ascii="Tahoma" w:hAnsi="Tahoma" w:cs="Tahoma" w:eastAsia="Tahoma"/>
-                <w:b w:val="0"/>
-                <w:sz w:val="20"/>
-                <w:rtl/>
-              </w:rPr>
-              <w:t>excel_export</w:t>
-            </w:r>
-          </w:p>
-        </w:tc>
-      </w:tr>
-      <w:tr>
-        <w:tc>
-          <w:tcPr>
-            <w:tcW w:type="dxa" w:w="2948"/>
-          </w:tcPr>
-          <w:p>
-            <w:pPr>
-              <w:bidi/>
-              <w:spacing w:after="40"/>
-              <w:jc w:val="right"/>
-            </w:pPr>
-            <w:r>
-              <w:rPr>
-                <w:rFonts w:ascii="Tahoma" w:hAnsi="Tahoma" w:cs="Tahoma" w:eastAsia="Tahoma"/>
-                <w:b w:val="0"/>
-                <w:sz w:val="20"/>
-                <w:rtl/>
-              </w:rPr>
-              <w:t>test_comparative</w:t>
-            </w:r>
-          </w:p>
-        </w:tc>
-        <w:tc>
-          <w:tcPr>
-            <w:tcW w:type="dxa" w:w="3402"/>
-          </w:tcPr>
-          <w:p>
-            <w:pPr>
-              <w:bidi/>
-              <w:spacing w:after="40"/>
-              <w:jc w:val="right"/>
-            </w:pPr>
-            <w:r>
-              <w:rPr>
-                <w:rFonts w:ascii="Tahoma" w:hAnsi="Tahoma" w:cs="Tahoma" w:eastAsia="Tahoma"/>
-                <w:b w:val="0"/>
-                <w:sz w:val="20"/>
-                <w:rtl/>
-              </w:rPr>
-              <w:t>comparative</w:t>
-            </w:r>
-          </w:p>
-        </w:tc>
-        <w:tc>
-          <w:tcPr>
-            <w:tcW w:type="dxa" w:w="2948"/>
-          </w:tcPr>
-          <w:p>
-            <w:pPr>
-              <w:bidi/>
-              <w:spacing w:after="40"/>
-              <w:jc w:val="right"/>
-            </w:pPr>
-            <w:r>
-              <w:rPr>
-                <w:rFonts w:ascii="Tahoma" w:hAnsi="Tahoma" w:cs="Tahoma" w:eastAsia="Tahoma"/>
-                <w:b w:val="0"/>
-                <w:sz w:val="20"/>
-                <w:rtl/>
-              </w:rPr>
-              <w:t>test_reporting_extra</w:t>
-            </w:r>
-          </w:p>
-        </w:tc>
-        <w:tc>
-          <w:tcPr>
-            <w:tcW w:type="dxa" w:w="3402"/>
-          </w:tcPr>
-          <w:p>
-            <w:pPr>
-              <w:bidi/>
-              <w:spacing w:after="40"/>
-              <w:jc w:val="right"/>
-            </w:pPr>
-            <w:r>
-              <w:rPr>
-                <w:rFonts w:ascii="Tahoma" w:hAnsi="Tahoma" w:cs="Tahoma" w:eastAsia="Tahoma"/>
-                <w:b w:val="0"/>
-                <w:sz w:val="20"/>
-                <w:rtl/>
-              </w:rPr>
-              <w:t>reporting</w:t>
-            </w:r>
-          </w:p>
-        </w:tc>
-      </w:tr>
-      <w:tr>
-        <w:tc>
-          <w:tcPr>
-            <w:tcW w:type="dxa" w:w="2948"/>
-          </w:tcPr>
-          <w:p>
-            <w:pPr>
-              <w:bidi/>
-              <w:spacing w:after="40"/>
-              <w:jc w:val="right"/>
-            </w:pPr>
-            <w:r>
-              <w:rPr>
-                <w:rFonts w:ascii="Tahoma" w:hAnsi="Tahoma" w:cs="Tahoma" w:eastAsia="Tahoma"/>
-                <w:b w:val="0"/>
-                <w:sz w:val="20"/>
-                <w:rtl/>
-              </w:rPr>
-              <w:t>test_backup</w:t>
-            </w:r>
-          </w:p>
-        </w:tc>
-        <w:tc>
-          <w:tcPr>
-            <w:tcW w:type="dxa" w:w="3402"/>
-          </w:tcPr>
-          <w:p>
-            <w:pPr>
-              <w:bidi/>
-              <w:spacing w:after="40"/>
-              <w:jc w:val="right"/>
-            </w:pPr>
-            <w:r>
-              <w:rPr>
-                <w:rFonts w:ascii="Tahoma" w:hAnsi="Tahoma" w:cs="Tahoma" w:eastAsia="Tahoma"/>
-                <w:b w:val="0"/>
-                <w:sz w:val="20"/>
-                <w:rtl/>
-              </w:rPr>
-              <w:t>backup + scheduled_backup</w:t>
-            </w:r>
-          </w:p>
-        </w:tc>
-        <w:tc>
-          <w:tcPr>
-            <w:tcW w:type="dxa" w:w="2948"/>
-          </w:tcPr>
-          <w:p>
-            <w:pPr>
-              <w:bidi/>
-              <w:spacing w:after="40"/>
-              <w:jc w:val="right"/>
-            </w:pPr>
-            <w:r>
-              <w:rPr>
-                <w:rFonts w:ascii="Tahoma" w:hAnsi="Tahoma" w:cs="Tahoma" w:eastAsia="Tahoma"/>
-                <w:b w:val="0"/>
-                <w:sz w:val="20"/>
-                <w:rtl/>
-              </w:rPr>
-              <w:t>test_user_manager</w:t>
-            </w:r>
-          </w:p>
-        </w:tc>
-        <w:tc>
-          <w:tcPr>
-            <w:tcW w:type="dxa" w:w="3402"/>
-          </w:tcPr>
-          <w:p>
-            <w:pPr>
-              <w:bidi/>
-              <w:spacing w:after="40"/>
-              <w:jc w:val="right"/>
-            </w:pPr>
-            <w:r>
-              <w:rPr>
-                <w:rFonts w:ascii="Tahoma" w:hAnsi="Tahoma" w:cs="Tahoma" w:eastAsia="Tahoma"/>
-                <w:b w:val="0"/>
-                <w:sz w:val="20"/>
-                <w:rtl/>
-              </w:rPr>
-              <w:t>user_manager</w:t>
-            </w:r>
-          </w:p>
-        </w:tc>
-      </w:tr>
-      <w:tr>
-        <w:tc>
-          <w:tcPr>
-            <w:tcW w:type="dxa" w:w="2948"/>
-          </w:tcPr>
-          <w:p>
-            <w:pPr>
-              <w:bidi/>
-              <w:spacing w:after="40"/>
-              <w:jc w:val="right"/>
-            </w:pPr>
-            <w:r>
-              <w:rPr>
-                <w:rFonts w:ascii="Tahoma" w:hAnsi="Tahoma" w:cs="Tahoma" w:eastAsia="Tahoma"/>
-                <w:b w:val="0"/>
-                <w:sz w:val="20"/>
-                <w:rtl/>
-              </w:rPr>
-              <w:t>test_bank_print</w:t>
-            </w:r>
-          </w:p>
-        </w:tc>
-        <w:tc>
-          <w:tcPr>
-            <w:tcW w:type="dxa" w:w="3402"/>
-          </w:tcPr>
-          <w:p>
-            <w:pPr>
-              <w:bidi/>
-              <w:spacing w:after="40"/>
-              <w:jc w:val="right"/>
-            </w:pPr>
-            <w:r>
-              <w:rPr>
-                <w:rFonts w:ascii="Tahoma" w:hAnsi="Tahoma" w:cs="Tahoma" w:eastAsia="Tahoma"/>
-                <w:b w:val="0"/>
-                <w:sz w:val="20"/>
-                <w:rtl/>
-              </w:rPr>
-              <w:t>bank_sync + print_manager</w:t>
-            </w:r>
-          </w:p>
-        </w:tc>
-        <w:tc>
-          <w:tcPr>
-            <w:tcW w:type="dxa" w:w="2948"/>
-          </w:tcPr>
-          <w:p>
-            <w:pPr>
-              <w:bidi/>
-              <w:spacing w:after="40"/>
-              <w:jc w:val="right"/>
-            </w:pPr>
-            <w:r>
-              <w:rPr>
-                <w:rFonts w:ascii="Tahoma" w:hAnsi="Tahoma" w:cs="Tahoma" w:eastAsia="Tahoma"/>
-                <w:b w:val="0"/>
-                <w:sz w:val="20"/>
-                <w:rtl/>
-              </w:rPr>
-              <w:t>test_update_checker_extra</w:t>
-            </w:r>
-          </w:p>
-        </w:tc>
-        <w:tc>
-          <w:tcPr>
-            <w:tcW w:type="dxa" w:w="3402"/>
-          </w:tcPr>
-          <w:p>
-            <w:pPr>
-              <w:bidi/>
-              <w:spacing w:after="40"/>
-              <w:jc w:val="right"/>
-            </w:pPr>
-            <w:r>
-              <w:rPr>
-                <w:rFonts w:ascii="Tahoma" w:hAnsi="Tahoma" w:cs="Tahoma" w:eastAsia="Tahoma"/>
-                <w:b w:val="0"/>
-                <w:sz w:val="20"/>
-                <w:rtl/>
-              </w:rPr>
-              <w:t>update_checker</w:t>
-            </w:r>
-          </w:p>
-        </w:tc>
-      </w:tr>
-      <w:tr>
-        <w:tc>
-          <w:tcPr>
-            <w:tcW w:type="dxa" w:w="2948"/>
-          </w:tcPr>
-          <w:p>
-            <w:pPr>
-              <w:bidi/>
-              <w:spacing w:after="40"/>
-              <w:jc w:val="right"/>
-            </w:pPr>
-            <w:r>
-              <w:rPr>
-                <w:rFonts w:ascii="Tahoma" w:hAnsi="Tahoma" w:cs="Tahoma" w:eastAsia="Tahoma"/>
-                <w:b w:val="0"/>
-                <w:sz w:val="20"/>
-                <w:rtl/>
-              </w:rPr>
-              <w:t>test_breakeven_costcenter</w:t>
-            </w:r>
-          </w:p>
-        </w:tc>
-        <w:tc>
-          <w:tcPr>
-            <w:tcW w:type="dxa" w:w="3402"/>
-          </w:tcPr>
-          <w:p>
-            <w:pPr>
-              <w:bidi/>
-              <w:spacing w:after="40"/>
-              <w:jc w:val="right"/>
-            </w:pPr>
-            <w:r>
-              <w:rPr>
-                <w:rFonts w:ascii="Tahoma" w:hAnsi="Tahoma" w:cs="Tahoma" w:eastAsia="Tahoma"/>
-                <w:b w:val="0"/>
-                <w:sz w:val="20"/>
-                <w:rtl/>
-              </w:rPr>
-              <w:t>breakeven + cost_center + forecasting</w:t>
-            </w:r>
-          </w:p>
-        </w:tc>
-        <w:tc>
-          <w:tcPr>
-            <w:tcW w:type="dxa" w:w="2948"/>
-          </w:tcPr>
-          <w:p>
-            <w:pPr>
-              <w:bidi/>
-              <w:spacing w:after="40"/>
-              <w:jc w:val="right"/>
-            </w:pPr>
-            <w:r>
-              <w:rPr>
-                <w:rFonts w:ascii="Tahoma" w:hAnsi="Tahoma" w:cs="Tahoma" w:eastAsia="Tahoma"/>
-                <w:b w:val="0"/>
-                <w:sz w:val="20"/>
-                <w:rtl/>
-              </w:rPr>
-              <w:t>test_cloud_sync_extra</w:t>
-            </w:r>
-          </w:p>
-        </w:tc>
-        <w:tc>
-          <w:tcPr>
-            <w:tcW w:type="dxa" w:w="3402"/>
-          </w:tcPr>
-          <w:p>
-            <w:pPr>
-              <w:bidi/>
-              <w:spacing w:after="40"/>
-              <w:jc w:val="right"/>
-            </w:pPr>
-            <w:r>
-              <w:rPr>
-                <w:rFonts w:ascii="Tahoma" w:hAnsi="Tahoma" w:cs="Tahoma" w:eastAsia="Tahoma"/>
-                <w:b w:val="0"/>
-                <w:sz w:val="20"/>
-                <w:rtl/>
-              </w:rPr>
-              <w:t>cloud_sync</w:t>
-            </w:r>
-          </w:p>
-        </w:tc>
-      </w:tr>
-      <w:tr>
-        <w:tc>
-          <w:tcPr>
-            <w:tcW w:type="dxa" w:w="2948"/>
-          </w:tcPr>
-          <w:p>
-            <w:pPr>
-              <w:bidi/>
-              <w:spacing w:after="40"/>
-              <w:jc w:val="right"/>
-            </w:pPr>
-            <w:r>
-              <w:rPr>
-                <w:rFonts w:ascii="Tahoma" w:hAnsi="Tahoma" w:cs="Tahoma" w:eastAsia="Tahoma"/>
-                <w:b w:val="0"/>
-                <w:sz w:val="20"/>
-                <w:rtl/>
-              </w:rPr>
-              <w:t>test_reporting_modules</w:t>
-            </w:r>
-          </w:p>
-        </w:tc>
-        <w:tc>
-          <w:tcPr>
-            <w:tcW w:type="dxa" w:w="3402"/>
-          </w:tcPr>
-          <w:p>
-            <w:pPr>
-              <w:bidi/>
-              <w:spacing w:after="40"/>
-              <w:jc w:val="right"/>
-            </w:pPr>
-            <w:r>
-              <w:rPr>
-                <w:rFonts w:ascii="Tahoma" w:hAnsi="Tahoma" w:cs="Tahoma" w:eastAsia="Tahoma"/>
-                <w:b w:val="0"/>
-                <w:sz w:val="20"/>
-                <w:rtl/>
-              </w:rPr>
-              <w:t>calculations + report_templates + activity_log</w:t>
-            </w:r>
-          </w:p>
-        </w:tc>
-        <w:tc>
-          <w:tcPr>
-            <w:tcW w:type="dxa" w:w="2948"/>
-          </w:tcPr>
-          <w:p>
-            <w:pPr>
-              <w:bidi/>
-              <w:spacing w:after="40"/>
-              <w:jc w:val="right"/>
-            </w:pPr>
-            <w:r>
-              <w:rPr>
-                <w:rFonts w:ascii="Tahoma" w:hAnsi="Tahoma" w:cs="Tahoma" w:eastAsia="Tahoma"/>
-                <w:b w:val="0"/>
-                <w:sz w:val="20"/>
-                <w:rtl/>
-              </w:rPr>
-              <w:t>test_tax_reminders_extra</w:t>
-            </w:r>
-          </w:p>
-        </w:tc>
-        <w:tc>
-          <w:tcPr>
-            <w:tcW w:type="dxa" w:w="3402"/>
-          </w:tcPr>
-          <w:p>
-            <w:pPr>
-              <w:bidi/>
-              <w:spacing w:after="40"/>
-              <w:jc w:val="right"/>
-            </w:pPr>
-            <w:r>
-              <w:rPr>
-                <w:rFonts w:ascii="Tahoma" w:hAnsi="Tahoma" w:cs="Tahoma" w:eastAsia="Tahoma"/>
-                <w:b w:val="0"/>
-                <w:sz w:val="20"/>
-                <w:rtl/>
-              </w:rPr>
-              <w:t>tax_reminders</w:t>
-            </w:r>
-          </w:p>
-        </w:tc>
-      </w:tr>
-      <w:tr>
-        <w:tc>
-          <w:tcPr>
-            <w:tcW w:type="dxa" w:w="2948"/>
-          </w:tcPr>
-          <w:p>
-            <w:pPr>
-              <w:bidi/>
-              <w:spacing w:after="40"/>
-              <w:jc w:val="right"/>
-            </w:pPr>
-            <w:r>
-              <w:rPr>
-                <w:rFonts w:ascii="Tahoma" w:hAnsi="Tahoma" w:cs="Tahoma" w:eastAsia="Tahoma"/>
-                <w:b w:val="0"/>
-                <w:sz w:val="20"/>
-                <w:rtl/>
-              </w:rPr>
-              <w:t>test_email_currency</w:t>
-            </w:r>
-          </w:p>
-        </w:tc>
-        <w:tc>
-          <w:tcPr>
-            <w:tcW w:type="dxa" w:w="3402"/>
-          </w:tcPr>
-          <w:p>
-            <w:pPr>
-              <w:bidi/>
-              <w:spacing w:after="40"/>
-              <w:jc w:val="right"/>
-            </w:pPr>
-            <w:r>
-              <w:rPr>
-                <w:rFonts w:ascii="Tahoma" w:hAnsi="Tahoma" w:cs="Tahoma" w:eastAsia="Tahoma"/>
-                <w:b w:val="0"/>
-                <w:sz w:val="20"/>
-                <w:rtl/>
-              </w:rPr>
-              <w:t>email_notifier + currency</w:t>
-            </w:r>
-          </w:p>
-        </w:tc>
-        <w:tc>
-          <w:tcPr>
-            <w:tcW w:type="dxa" w:w="2948"/>
-          </w:tcPr>
-          <w:p>
-            <w:pPr>
-              <w:bidi/>
-              <w:spacing w:after="40"/>
-              <w:jc w:val="right"/>
-            </w:pPr>
-            <w:r>
-              <w:rPr>
-                <w:rFonts w:ascii="Tahoma" w:hAnsi="Tahoma" w:cs="Tahoma" w:eastAsia="Tahoma"/>
-                <w:b w:val="0"/>
-                <w:sz w:val="20"/>
-                <w:rtl/>
-              </w:rPr>
-              <w:t>test_tax_reports_extra</w:t>
-            </w:r>
-          </w:p>
-        </w:tc>
-        <w:tc>
-          <w:tcPr>
-            <w:tcW w:type="dxa" w:w="3402"/>
-          </w:tcPr>
-          <w:p>
-            <w:pPr>
-              <w:bidi/>
-              <w:spacing w:after="40"/>
-              <w:jc w:val="right"/>
-            </w:pPr>
-            <w:r>
-              <w:rPr>
-                <w:rFonts w:ascii="Tahoma" w:hAnsi="Tahoma" w:cs="Tahoma" w:eastAsia="Tahoma"/>
-                <w:b w:val="0"/>
-                <w:sz w:val="20"/>
-                <w:rtl/>
-              </w:rPr>
-              <w:t>tax_reports</w:t>
-            </w:r>
-          </w:p>
-        </w:tc>
-      </w:tr>
-      <w:tr>
-        <w:tc>
-          <w:tcPr>
-            <w:tcW w:type="dxa" w:w="2948"/>
-          </w:tcPr>
-          <w:p>
-            <w:pPr>
-              <w:bidi/>
-              <w:spacing w:after="40"/>
-              <w:jc w:val="right"/>
-            </w:pPr>
-            <w:r>
-              <w:rPr>
-                <w:rFonts w:ascii="Tahoma" w:hAnsi="Tahoma" w:cs="Tahoma" w:eastAsia="Tahoma"/>
-                <w:b w:val="0"/>
-                <w:sz w:val="20"/>
-                <w:rtl/>
-              </w:rPr>
-              <w:t>test_small_gaps</w:t>
-            </w:r>
-          </w:p>
-        </w:tc>
-        <w:tc>
-          <w:tcPr>
-            <w:tcW w:type="dxa" w:w="3402"/>
-          </w:tcPr>
-          <w:p>
-            <w:pPr>
-              <w:bidi/>
-              <w:spacing w:after="40"/>
-              <w:jc w:val="right"/>
-            </w:pPr>
-            <w:r>
-              <w:rPr>
-                <w:rFonts w:ascii="Tahoma" w:hAnsi="Tahoma" w:cs="Tahoma" w:eastAsia="Tahoma"/>
-                <w:b w:val="0"/>
-                <w:sz w:val="20"/>
-                <w:rtl/>
-              </w:rPr>
-              <w:t>budget + validation + advanced_dashboard</w:t>
-            </w:r>
-          </w:p>
-        </w:tc>
-        <w:tc>
-          <w:tcPr>
-            <w:tcW w:type="dxa" w:w="2948"/>
-          </w:tcPr>
-          <w:p>
-            <w:pPr>
-              <w:bidi/>
-              <w:spacing w:after="40"/>
-              <w:jc w:val="right"/>
-            </w:pPr>
-            <w:r>
-              <w:rPr>
-                <w:rFonts w:ascii="Tahoma" w:hAnsi="Tahoma" w:cs="Tahoma" w:eastAsia="Tahoma"/>
-                <w:b w:val="0"/>
-                <w:sz w:val="20"/>
-                <w:rtl/>
-              </w:rPr>
-              <w:t>الملفات القديمة</w:t>
-            </w:r>
-          </w:p>
-        </w:tc>
-        <w:tc>
-          <w:tcPr>
-            <w:tcW w:type="dxa" w:w="3402"/>
-          </w:tcPr>
-          <w:p>
-            <w:pPr>
-              <w:bidi/>
-              <w:spacing w:after="40"/>
-              <w:jc w:val="right"/>
-            </w:pPr>
-            <w:r>
-              <w:rPr>
-                <w:rFonts w:ascii="Tahoma" w:hAnsi="Tahoma" w:cs="Tahoma" w:eastAsia="Tahoma"/>
-                <w:b w:val="0"/>
-                <w:sz w:val="20"/>
-                <w:rtl/>
-              </w:rPr>
-              <w:t>الميزات الأساسية</w:t>
-            </w:r>
-          </w:p>
-        </w:tc>
-      </w:tr>
-    </w:tbl>
-    <w:p>
-      <w:pPr>
-        <w:spacing w:after="80"/>
-      </w:pPr>
+        <w:t>14.2 ملفات الاختبار</w:t>
+      </w:r>
+    </w:p>
+    <w:p>
+      <w:pPr>
+        <w:bidi/>
+        <w:spacing w:after="120" w:before="0" w:line="276" w:lineRule="auto"/>
+        <w:jc w:val="right"/>
+      </w:pPr>
+      <w:r>
+        <w:rPr>
+          <w:rFonts w:ascii="Tahoma" w:hAnsi="Tahoma" w:cs="Tahoma" w:eastAsia="Tahoma"/>
+          <w:b w:val="0"/>
+          <w:sz w:val="22"/>
+          <w:rtl/>
+        </w:rPr>
+        <w:t>يضم المشروع 65 ملف اختبار موزعة على فئات:</w:t>
+      </w:r>
+    </w:p>
+    <w:p>
+      <w:pPr>
+        <w:bidi/>
+        <w:spacing w:after="60"/>
+        <w:ind w:left="454"/>
+        <w:jc w:val="right"/>
+      </w:pPr>
+      <w:r>
+        <w:rPr>
+          <w:rFonts w:ascii="Tahoma" w:hAnsi="Tahoma" w:cs="Tahoma" w:eastAsia="Tahoma"/>
+          <w:b/>
+          <w:sz w:val="22"/>
+          <w:rtl/>
+        </w:rPr>
+        <w:t xml:space="preserve">• </w:t>
+      </w:r>
+      <w:r>
+        <w:rPr>
+          <w:rFonts w:ascii="Tahoma" w:hAnsi="Tahoma" w:cs="Tahoma" w:eastAsia="Tahoma"/>
+          <w:b w:val="0"/>
+          <w:sz w:val="22"/>
+          <w:rtl/>
+        </w:rPr>
+        <w:t>اختبارات الوحدات الأساسية: test_calculation.py (النسب المالية)، test_analysis.py (DuPont)، test_audit.py (التدقيق)، test_tax.py (الجباية)</w:t>
+      </w:r>
+    </w:p>
+    <w:p>
+      <w:pPr>
+        <w:bidi/>
+        <w:spacing w:after="60"/>
+        <w:ind w:left="454"/>
+        <w:jc w:val="right"/>
+      </w:pPr>
+      <w:r>
+        <w:rPr>
+          <w:rFonts w:ascii="Tahoma" w:hAnsi="Tahoma" w:cs="Tahoma" w:eastAsia="Tahoma"/>
+          <w:b/>
+          <w:sz w:val="22"/>
+          <w:rtl/>
+        </w:rPr>
+        <w:t xml:space="preserve">• </w:t>
+      </w:r>
+      <w:r>
+        <w:rPr>
+          <w:rFonts w:ascii="Tahoma" w:hAnsi="Tahoma" w:cs="Tahoma" w:eastAsia="Tahoma"/>
+          <w:b w:val="0"/>
+          <w:sz w:val="22"/>
+          <w:rtl/>
+        </w:rPr>
+        <w:t>اختبارات الميزات: test_cashflow.py، test_comparative.py، test_breakeven.py، test_budget.py، test_forecasting.py</w:t>
+      </w:r>
+    </w:p>
+    <w:p>
+      <w:pPr>
+        <w:bidi/>
+        <w:spacing w:after="60"/>
+        <w:ind w:left="454"/>
+        <w:jc w:val="right"/>
+      </w:pPr>
+      <w:r>
+        <w:rPr>
+          <w:rFonts w:ascii="Tahoma" w:hAnsi="Tahoma" w:cs="Tahoma" w:eastAsia="Tahoma"/>
+          <w:b/>
+          <w:sz w:val="22"/>
+          <w:rtl/>
+        </w:rPr>
+        <w:t xml:space="preserve">• </w:t>
+      </w:r>
+      <w:r>
+        <w:rPr>
+          <w:rFonts w:ascii="Tahoma" w:hAnsi="Tahoma" w:cs="Tahoma" w:eastAsia="Tahoma"/>
+          <w:b w:val="0"/>
+          <w:sz w:val="22"/>
+          <w:rtl/>
+        </w:rPr>
+        <w:t>اختبارات متقدمة: test_ai_insights.py، test_benchmarks.py، test_scenarios.py، test_cost_center.py، test_advanced_dashboard.py</w:t>
+      </w:r>
+    </w:p>
+    <w:p>
+      <w:pPr>
+        <w:bidi/>
+        <w:spacing w:after="60"/>
+        <w:ind w:left="454"/>
+        <w:jc w:val="right"/>
+      </w:pPr>
+      <w:r>
+        <w:rPr>
+          <w:rFonts w:ascii="Tahoma" w:hAnsi="Tahoma" w:cs="Tahoma" w:eastAsia="Tahoma"/>
+          <w:b/>
+          <w:sz w:val="22"/>
+          <w:rtl/>
+        </w:rPr>
+        <w:t xml:space="preserve">• </w:t>
+      </w:r>
+      <w:r>
+        <w:rPr>
+          <w:rFonts w:ascii="Tahoma" w:hAnsi="Tahoma" w:cs="Tahoma" w:eastAsia="Tahoma"/>
+          <w:b w:val="0"/>
+          <w:sz w:val="22"/>
+          <w:rtl/>
+        </w:rPr>
+        <w:t>اختبارات واجهات: test_ui.py، test_ui_views.py، test_ui_constants.py</w:t>
+      </w:r>
+    </w:p>
+    <w:p>
+      <w:pPr>
+        <w:bidi/>
+        <w:spacing w:after="60"/>
+        <w:ind w:left="454"/>
+        <w:jc w:val="right"/>
+      </w:pPr>
+      <w:r>
+        <w:rPr>
+          <w:rFonts w:ascii="Tahoma" w:hAnsi="Tahoma" w:cs="Tahoma" w:eastAsia="Tahoma"/>
+          <w:b/>
+          <w:sz w:val="22"/>
+          <w:rtl/>
+        </w:rPr>
+        <w:t xml:space="preserve">• </w:t>
+      </w:r>
+      <w:r>
+        <w:rPr>
+          <w:rFonts w:ascii="Tahoma" w:hAnsi="Tahoma" w:cs="Tahoma" w:eastAsia="Tahoma"/>
+          <w:b w:val="0"/>
+          <w:sz w:val="22"/>
+          <w:rtl/>
+        </w:rPr>
+        <w:t>اختبارات تكامل: test_integration_workflow.py، test_integration_database.py، test_integration_performance.py</w:t>
+      </w:r>
+    </w:p>
+    <w:p>
+      <w:pPr>
+        <w:bidi/>
+        <w:spacing w:after="60"/>
+        <w:ind w:left="454"/>
+        <w:jc w:val="right"/>
+      </w:pPr>
+      <w:r>
+        <w:rPr>
+          <w:rFonts w:ascii="Tahoma" w:hAnsi="Tahoma" w:cs="Tahoma" w:eastAsia="Tahoma"/>
+          <w:b/>
+          <w:sz w:val="22"/>
+          <w:rtl/>
+        </w:rPr>
+        <w:t xml:space="preserve">• </w:t>
+      </w:r>
+      <w:r>
+        <w:rPr>
+          <w:rFonts w:ascii="Tahoma" w:hAnsi="Tahoma" w:cs="Tahoma" w:eastAsia="Tahoma"/>
+          <w:b w:val="0"/>
+          <w:sz w:val="22"/>
+          <w:rtl/>
+        </w:rPr>
+        <w:t>اختبارات قبول: test_uat.py (رحلة كاملة بـ35 شاشة)</w:t>
+      </w:r>
+    </w:p>
+    <w:p>
+      <w:pPr>
+        <w:bidi/>
+        <w:spacing w:after="60"/>
+        <w:ind w:left="454"/>
+        <w:jc w:val="right"/>
+      </w:pPr>
+      <w:r>
+        <w:rPr>
+          <w:rFonts w:ascii="Tahoma" w:hAnsi="Tahoma" w:cs="Tahoma" w:eastAsia="Tahoma"/>
+          <w:b/>
+          <w:sz w:val="22"/>
+          <w:rtl/>
+        </w:rPr>
+        <w:t xml:space="preserve">• </w:t>
+      </w:r>
+      <w:r>
+        <w:rPr>
+          <w:rFonts w:ascii="Tahoma" w:hAnsi="Tahoma" w:cs="Tahoma" w:eastAsia="Tahoma"/>
+          <w:b w:val="0"/>
+          <w:sz w:val="22"/>
+          <w:rtl/>
+        </w:rPr>
+        <w:t>اختبارات تجارية: test_licensing.py، test_encryption.py، test_entitlement.py (تغطية 99%+)</w:t>
+      </w:r>
+    </w:p>
+    <w:p>
+      <w:pPr>
+        <w:bidi/>
+        <w:spacing w:after="60"/>
+        <w:ind w:left="454"/>
+        <w:jc w:val="right"/>
+      </w:pPr>
+      <w:r>
+        <w:rPr>
+          <w:rFonts w:ascii="Tahoma" w:hAnsi="Tahoma" w:cs="Tahoma" w:eastAsia="Tahoma"/>
+          <w:b/>
+          <w:sz w:val="22"/>
+          <w:rtl/>
+        </w:rPr>
+        <w:t xml:space="preserve">• </w:t>
+      </w:r>
+      <w:r>
+        <w:rPr>
+          <w:rFonts w:ascii="Tahoma" w:hAnsi="Tahoma" w:cs="Tahoma" w:eastAsia="Tahoma"/>
+          <w:b w:val="0"/>
+          <w:sz w:val="22"/>
+          <w:rtl/>
+        </w:rPr>
+        <w:t>اختبارات أداء: test_startup_perf.py</w:t>
+      </w:r>
+    </w:p>
+    <w:p>
+      <w:pPr>
+        <w:bidi/>
+        <w:spacing w:after="60"/>
+        <w:ind w:left="454"/>
+        <w:jc w:val="right"/>
+      </w:pPr>
+      <w:r>
+        <w:rPr>
+          <w:rFonts w:ascii="Tahoma" w:hAnsi="Tahoma" w:cs="Tahoma" w:eastAsia="Tahoma"/>
+          <w:b/>
+          <w:sz w:val="22"/>
+          <w:rtl/>
+        </w:rPr>
+        <w:t xml:space="preserve">• </w:t>
+      </w:r>
+      <w:r>
+        <w:rPr>
+          <w:rFonts w:ascii="Tahoma" w:hAnsi="Tahoma" w:cs="Tahoma" w:eastAsia="Tahoma"/>
+          <w:b w:val="0"/>
+          <w:sz w:val="22"/>
+          <w:rtl/>
+        </w:rPr>
+        <w:t>المجموع: 2020 اختباراً ناجحاً (python -m pytest tests -q)</w:t>
+      </w:r>
     </w:p>
     <w:p>
       <w:pPr>
@@ -8597,7 +9335,7 @@
           <w:sz w:val="22"/>
           <w:rtl/>
         </w:rPr>
-        <w:t>i18n: 1530 مفتاحاً × 3 لغات (AR/EN/FR)</w:t>
+        <w:t>i18n: 2018 مفتاحاً × 3 لغات (AR/EN/FR)</w:t>
       </w:r>
     </w:p>
     <w:p>
@@ -8676,7 +9414,7 @@
           <w:sz w:val="22"/>
           <w:rtl/>
         </w:rPr>
-        <w:t>28 شاشة تفاعلية كاملة مع دعم RTL للعربية و3 لغات و3 ثيمات</w:t>
+        <w:t>35 شاشة تفاعلية كاملة مع دعم RTL للعربية و3 لغات و3 ثيمات</w:t>
       </w:r>
     </w:p>
     <w:p>
@@ -8780,7 +9518,7 @@
           <w:sz w:val="22"/>
           <w:rtl/>
         </w:rPr>
-        <w:t>1800 اختباراً ناجحاً مع تغطية 100% للوحدات</w:t>
+        <w:t>2020 اختباراً ناجحاً مع تغطية 100% للوحدات</w:t>
       </w:r>
     </w:p>
     <w:p>
@@ -8806,7 +9544,7 @@
           <w:sz w:val="22"/>
           <w:rtl/>
         </w:rPr>
-        <w:t>أداء محسّن: إقلاع 49ms وذاكرة 45MB</w:t>
+        <w:t>أداء محسّن: إقلاع 44ms وذاكرة 45MB</w:t>
       </w:r>
     </w:p>
     <w:p>
@@ -8832,7 +9570,7 @@
           <w:sz w:val="22"/>
           <w:rtl/>
         </w:rPr>
-        <w:t>مثبت Inno Setup (51.6MB) ونسخة ZIP (82.9MB) وتحديث تلقائي مخفي</w:t>
+        <w:t>مثبت Inno Setup (66.9MB) ونسخة ZIP (109.4MB) وتحديث تلقائي مخفي</w:t>
       </w:r>
     </w:p>
     <w:p>
@@ -8885,7 +9623,7 @@
           <w:sz w:val="22"/>
           <w:rtl/>
         </w:rPr>
-        <w:t>تم تطوير المشروع وفق أفضل ممارسات هندسة البرمجيات، مع الالتزام بمبادئ الجودة والاختبار المستمر، مما نتج عنه 1800 اختبار وحدة ناجحاً وتغطية 100% للوحدات. كما تم توفير نظام تحديث تلقائي لتسهيل عملية التطوير والصيانة المستمرة.</w:t>
+        <w:t>تم تطوير المشروع وفق أفضل ممارسات هندسة البرمجيات، مع الالتزام بمبادئ الجودة والاختبار المستمر، مما نتج عنه 2020 اختبار وحدة ناجحاً وتغطية 100% للوحدات. كما تم توفير نظام تحديث تلقائي لتسهيل عملية التطوير والصيانة المستمرة.</w:t>
       </w:r>
     </w:p>
     <w:p>
@@ -8940,7 +9678,7 @@
           <w:sz w:val="26"/>
           <w:rtl/>
         </w:rPr>
-        <w:t>17.1 المدى القصير</w:t>
+        <w:t>17.1 المدى القصير (قيد التطوير)</w:t>
       </w:r>
     </w:p>
     <w:p>
@@ -8966,7 +9704,7 @@
           <w:sz w:val="22"/>
           <w:rtl/>
         </w:rPr>
-        <w:t>1. ربط API مع البنوك الجزائرية للمزامنة البنكية التلقائية</w:t>
+        <w:t>1. وحدة المشتريات: إدارة طلبات الشراء وأوامر التوريد والموردين (شاشة 36)</w:t>
       </w:r>
     </w:p>
     <w:p>
@@ -8992,7 +9730,7 @@
           <w:sz w:val="22"/>
           <w:rtl/>
         </w:rPr>
-        <w:t>2. دعم الفواتير الإلكترونية (E-Invoicing)</w:t>
+        <w:t>2. دعم الفواتير الإلكترونية (E-Invoicing — شاشة 37)</w:t>
       </w:r>
     </w:p>
     <w:p>
@@ -9018,7 +9756,7 @@
           <w:sz w:val="22"/>
           <w:rtl/>
         </w:rPr>
-        <w:t>3. توقيع رقمي للنسخ التنفيذية وتجاوز Smart App Control</w:t>
+        <w:t>3. المزامنة البنكية التلقائية: إطار API بنكي مع محاكي للتجربة دون اتصال</w:t>
       </w:r>
     </w:p>
     <w:p>
@@ -9062,7 +9800,7 @@
           <w:sz w:val="22"/>
           <w:rtl/>
         </w:rPr>
-        <w:t>1. تطوير نسخة سحابية (Cloud) مع قاعدة بيانات مركزية</w:t>
+        <w:t>1. توقيع رقمي للنسخ التنفيذية وتجاوز Smart App Control</w:t>
       </w:r>
     </w:p>
     <w:p>
@@ -9088,7 +9826,7 @@
           <w:sz w:val="22"/>
           <w:rtl/>
         </w:rPr>
-        <w:t>2. إضافة وحدات إدارة المخزون والمشتريات</w:t>
+        <w:t>2. تطوير نسخة سحابية (Cloud) مع قاعدة بيانات مركزية متعددة المستخدمين</w:t>
       </w:r>
     </w:p>
     <w:p>
@@ -9140,7 +9878,7 @@
           <w:sz w:val="22"/>
           <w:rtl/>
         </w:rPr>
-        <w:t>4. تحليل متقدم باستخدام Machine Learning للتنبؤ بالأزمات المالية</w:t>
+        <w:t>4. تحليل متقدم باستخدام Machine Learning (scikit-learn) للتنبؤ بالأزمات المالية — ترقية من النماذج الإحصائية الحالية</w:t>
       </w:r>
     </w:p>
     <w:p>
@@ -9184,7 +9922,7 @@
           <w:sz w:val="22"/>
           <w:rtl/>
         </w:rPr>
-        <w:t>1. تطوير تطبيق جوال (Mobile App) لمتابعة المؤشرات</w:t>
+        <w:t>1. تطوير تطبيق جوال (Mobile App) لمتابعة المؤشرات — معلق حالياً</w:t>
       </w:r>
     </w:p>
     <w:p>
@@ -9210,7 +9948,7 @@
           <w:sz w:val="22"/>
           <w:rtl/>
         </w:rPr>
-        <w:t>2. ربط مع مصلحة الضرائب الجزائرية للتصريح الإلكتروني</w:t>
+        <w:t>2. الربط مع مصلحة الضرائب الجزائرية للتصريح الإلكتروني</w:t>
       </w:r>
     </w:p>
     <w:p>
@@ -9262,7 +10000,7 @@
           <w:sz w:val="22"/>
           <w:rtl/>
         </w:rPr>
-        <w:t>4. منصة ذكاء اصطناعي متكاملة للتحليل المالي والتنبؤ</w:t>
+        <w:t>4. منصة ذكاء اصطناعي متكاملة للتحليل المالي والتنبؤ — يتم تطويرها حالياً</w:t>
       </w:r>
     </w:p>
     <w:sectPr>

</xml_diff>